<commit_message>
docs(propuesta): agregar el Anexo A con las pantallas del prototipo
Trece figuras capturadas de la aplicación en ejecución, incrustadas en el
.docx (no enlazadas: LibreOffice escribe `r:link` cuando la imagen va como
ruta, y el documento se ve roto en cualquier otra computadora).

Cubren los tres roles —coordinación, docente y estudiante— y cada pie de
figura amarra la pantalla a un objetivo específico de la propuesta en vez de
describirla.

Los datos visibles son de cuentas de prueba. La LOPNNA, citada en las bases
legales de la propia propuesta, protege la imagen y la intimidad de los
estudiantes: ningún nombre de menor aparece en el documento. Por eso queda
fuera la captura del listado de alumnos de coordinación.

Co-Authored-By: Claude Opus 5 <noreply@anthropic.com>
Claude-Session: https://claude.ai/code/session_014DSSx6PSXtA47FhmmA2RnY
</commit_message>
<xml_diff>
--- a/docs/PROPUESTA_CAPITULO_I_EDUVERSO_ACTUALIZADA.docx
+++ b/docs/PROPUESTA_CAPITULO_I_EDUVERSO_ACTUALIZADA.docx
@@ -378,14 +378,14 @@
         </w:tblCellMar>
       </w:tblPr>
       <w:tblGrid>
-        <w:gridCol w:w="3675"/>
+        <w:gridCol w:w="3676"/>
         <w:gridCol w:w="4261"/>
       </w:tblGrid>
       <w:tr>
         <w:trPr/>
         <w:tc>
           <w:tcPr>
-            <w:tcW w:w="3675" w:type="dxa"/>
+            <w:tcW w:w="3676" w:type="dxa"/>
             <w:tcBorders>
               <w:top w:val="single" w:sz="6" w:space="0" w:color="808080"/>
               <w:left w:val="single" w:sz="6" w:space="0" w:color="808080"/>
@@ -438,7 +438,7 @@
         <w:trPr/>
         <w:tc>
           <w:tcPr>
-            <w:tcW w:w="3675" w:type="dxa"/>
+            <w:tcW w:w="3676" w:type="dxa"/>
             <w:tcBorders>
               <w:left w:val="single" w:sz="6" w:space="0" w:color="808080"/>
               <w:bottom w:val="single" w:sz="6" w:space="0" w:color="808080"/>
@@ -1897,92 +1897,274 @@
         <w:jc w:val="both"/>
         <w:rPr>
           <w:i/>
+        </w:rPr>
+      </w:pPr>
+      <w:r>
+        <w:rPr>
           <w:i/>
         </w:rPr>
-      </w:pPr>
+        <w:t>Nota para el proponente: completar cada ficha con los datos de tres trabajos de grado o artículos arbitrados consultados, preferentemente de los últimos cinco años. Se sugiere incluir al menos uno de la propia UNEG. Estructura de cada ficha: autor, año, título, institución, objetivo, metodología, resultados y aporte a la presente investigación.</w:t>
+      </w:r>
+    </w:p>
+    <w:p>
+      <w:pPr>
+        <w:pStyle w:val="BodyText"/>
+        <w:bidi w:val="0"/>
+        <w:spacing w:before="0" w:after="160"/>
+        <w:ind w:hanging="0" w:left="0" w:right="0"/>
+        <w:jc w:val="both"/>
+        <w:rPr/>
+      </w:pPr>
+      <w:r>
+        <w:rPr>
+          <w:b/>
+        </w:rPr>
+        <w:t>Antecedente 1.</w:t>
+      </w:r>
+      <w:r>
+        <w:rPr/>
+        <w:t xml:space="preserve"> Sistema de gestión académica web para institución educativa venezolana. </w:t>
+      </w:r>
       <w:r>
         <w:rPr>
           <w:i/>
         </w:rPr>
-        <w:t>Nota para el proponente: completar cada ficha con los datos de tres trabajos de grado o artículos arbitrados consultados, preferentemente de los últimos cinco años. Se sugiere incluir al menos uno de la propia UNEG. Estructura de cada ficha: autor, año, título, institución, objetivo, metodología, resultados y aporte a la presente investigación.</w:t>
-      </w:r>
-    </w:p>
-    <w:p>
-      <w:pPr>
-        <w:pStyle w:val="BodyText"/>
-        <w:bidi w:val="0"/>
-        <w:spacing w:before="0" w:after="160"/>
-        <w:ind w:hanging="0" w:left="0" w:right="0"/>
-        <w:jc w:val="both"/>
-        <w:rPr/>
-      </w:pPr>
-      <w:r>
-        <w:rPr>
-          <w:b/>
-        </w:rPr>
-        <w:t>Antecedente 1.</w:t>
-      </w:r>
-      <w:r>
-        <w:rPr/>
-        <w:t xml:space="preserve"> Sistema de gestión académica web para institución educativa venezolana. </w:t>
+        <w:t>(Aporte esperado: modelo de datos del ciclo de vida del estudiante y esquema de roles de usuario.)</w:t>
+      </w:r>
+    </w:p>
+    <w:p>
+      <w:pPr>
+        <w:pStyle w:val="BodyText"/>
+        <w:bidi w:val="0"/>
+        <w:spacing w:before="0" w:after="160"/>
+        <w:ind w:hanging="0" w:left="0" w:right="0"/>
+        <w:jc w:val="both"/>
+        <w:rPr/>
+      </w:pPr>
+      <w:r>
+        <w:rPr>
+          <w:b/>
+        </w:rPr>
+        <w:t>Antecedente 2.</w:t>
+      </w:r>
+      <w:r>
+        <w:rPr/>
+        <w:t xml:space="preserve"> Aplicación de mecánicas de gamificación en educación básica. </w:t>
       </w:r>
       <w:r>
         <w:rPr>
           <w:i/>
         </w:rPr>
-        <w:t>(Aporte esperado: modelo de datos del ciclo de vida del estudiante y esquema de roles de usuario.)</w:t>
-      </w:r>
-    </w:p>
-    <w:p>
-      <w:pPr>
-        <w:pStyle w:val="BodyText"/>
-        <w:bidi w:val="0"/>
-        <w:spacing w:before="0" w:after="160"/>
-        <w:ind w:hanging="0" w:left="0" w:right="0"/>
-        <w:jc w:val="both"/>
-        <w:rPr/>
-      </w:pPr>
-      <w:r>
-        <w:rPr>
-          <w:b/>
-        </w:rPr>
-        <w:t>Antecedente 2.</w:t>
-      </w:r>
-      <w:r>
-        <w:rPr/>
-        <w:t xml:space="preserve"> Aplicación de mecánicas de gamificación en educación básica. </w:t>
+        <w:t>(Aporte esperado: evidencia sobre el efecto de los sistemas de puntos y niveles en la participación estudiantil.)</w:t>
+      </w:r>
+    </w:p>
+    <w:p>
+      <w:pPr>
+        <w:pStyle w:val="BodyText"/>
+        <w:bidi w:val="0"/>
+        <w:spacing w:before="0" w:after="160"/>
+        <w:ind w:hanging="0" w:left="0" w:right="0"/>
+        <w:jc w:val="both"/>
+        <w:rPr/>
+      </w:pPr>
+      <w:r>
+        <w:rPr>
+          <w:b/>
+        </w:rPr>
+        <w:t>Antecedente 3.</w:t>
+      </w:r>
+      <w:r>
+        <w:rPr/>
+        <w:t xml:space="preserve"> Incorporación de asistentes conversacionales basados en Modelos Extensos de Lenguaje en entornos educativos. </w:t>
       </w:r>
       <w:r>
         <w:rPr>
           <w:i/>
         </w:rPr>
-        <w:t>(Aporte esperado: evidencia sobre el efecto de los sistemas de puntos y niveles en la participación estudiantil.)</w:t>
-      </w:r>
-    </w:p>
-    <w:p>
-      <w:pPr>
-        <w:pStyle w:val="BodyText"/>
-        <w:bidi w:val="0"/>
-        <w:spacing w:before="0" w:after="160"/>
-        <w:ind w:hanging="0" w:left="0" w:right="0"/>
-        <w:jc w:val="both"/>
-        <w:rPr/>
-      </w:pPr>
-      <w:r>
-        <w:rPr>
-          <w:b/>
-        </w:rPr>
-        <w:t>Antecedente 3.</w:t>
-      </w:r>
-      <w:r>
-        <w:rPr/>
-        <w:t xml:space="preserve"> Incorporación de asistentes conversacionales basados en Modelos Extensos de Lenguaje en entornos educativos. </w:t>
+        <w:t>(Aporte esperado: técnicas de acotamiento de la salida del modelo y consideraciones éticas con población menor de edad.)</w:t>
+      </w:r>
+    </w:p>
+    <w:p>
+      <w:pPr>
+        <w:pStyle w:val="BodyText"/>
+        <w:bidi w:val="0"/>
+        <w:spacing w:before="280" w:after="120"/>
+        <w:ind w:hanging="0" w:left="0" w:right="0"/>
+        <w:jc w:val="left"/>
+        <w:rPr>
+          <w:b/>
+          <w:sz w:val="25"/>
+        </w:rPr>
+      </w:pPr>
+      <w:r>
+        <w:rPr>
+          <w:b/>
+          <w:sz w:val="25"/>
+        </w:rPr>
+        <w:t>Bases teóricas</w:t>
+      </w:r>
+    </w:p>
+    <w:p>
+      <w:pPr>
+        <w:pStyle w:val="BodyText"/>
+        <w:bidi w:val="0"/>
+        <w:spacing w:before="0" w:after="160"/>
+        <w:ind w:hanging="0" w:left="0" w:right="0"/>
+        <w:jc w:val="both"/>
+        <w:rPr/>
+      </w:pPr>
+      <w:r>
+        <w:rPr>
+          <w:b/>
+        </w:rPr>
+        <w:t>Aplicaciones Web Progresivas (PWA).</w:t>
+      </w:r>
+      <w:r>
+        <w:rPr/>
+        <w:t xml:space="preserve"> Modelo de desarrollo que permite a una aplicación web instalarse en el dispositivo, presentar un icono propio y operar con capacidades de almacenamiento local, sin requerir distribución por tiendas de aplicaciones. Se sustenta en tres elementos: el manifiesto de la aplicación, el trabajador de servicio (</w:t>
       </w:r>
       <w:r>
         <w:rPr>
           <w:i/>
         </w:rPr>
-        <w:t>(Aporte esperado: técnicas de acotamiento de la salida del modelo y consideraciones éticas con población menor de edad.)</w:t>
+        <w:t>service worker</w:t>
+      </w:r>
+      <w:r>
+        <w:rPr/>
+        <w:t>) y la entrega por conexión segura.</w:t>
+      </w:r>
+    </w:p>
+    <w:p>
+      <w:pPr>
+        <w:pStyle w:val="BodyText"/>
+        <w:bidi w:val="0"/>
+        <w:spacing w:before="0" w:after="160"/>
+        <w:ind w:hanging="0" w:left="0" w:right="0"/>
+        <w:jc w:val="both"/>
+        <w:rPr/>
+      </w:pPr>
+      <w:r>
+        <w:rPr>
+          <w:b/>
+        </w:rPr>
+        <w:t>Gamificación educativa.</w:t>
+      </w:r>
+      <w:r>
+        <w:rPr/>
+        <w:t xml:space="preserve"> Kapp (2012) la define como el uso de mecánicas, estética y pensamiento de juego para motivar la acción y promover el aprendizaje. En la presente propuesta se concreta en puntos de experiencia, progresión por niveles y tablas de clasificación.</w:t>
+      </w:r>
+    </w:p>
+    <w:p>
+      <w:pPr>
+        <w:pStyle w:val="BodyText"/>
+        <w:bidi w:val="0"/>
+        <w:spacing w:before="0" w:after="160"/>
+        <w:ind w:hanging="0" w:left="0" w:right="0"/>
+        <w:jc w:val="both"/>
+        <w:rPr/>
+      </w:pPr>
+      <w:r>
+        <w:rPr>
+          <w:b/>
+        </w:rPr>
+        <w:t>Teoría cognitiva del aprendizaje multimedia.</w:t>
+      </w:r>
+      <w:r>
+        <w:rPr/>
+        <w:t xml:space="preserve"> Mayer (2009) establece que el aprendizaje es más efectivo cuando la información verbal y la visual se presentan de forma integrada, y formula, entre otros, los principios de coherencia, señalización y contigüidad espacial, aplicados en el diseño del material de refuerzo de este sistema.</w:t>
+      </w:r>
+    </w:p>
+    <w:p>
+      <w:pPr>
+        <w:pStyle w:val="BodyText"/>
+        <w:bidi w:val="0"/>
+        <w:spacing w:before="0" w:after="160"/>
+        <w:ind w:hanging="0" w:left="0" w:right="0"/>
+        <w:jc w:val="both"/>
+        <w:rPr/>
+      </w:pPr>
+      <w:r>
+        <w:rPr>
+          <w:b/>
+        </w:rPr>
+        <w:t>Teoría de la carga cognitiva.</w:t>
+      </w:r>
+      <w:r>
+        <w:rPr/>
+        <w:t xml:space="preserve"> Sweller, Ayres y Kalyuga (2011) distinguen entre carga intrínseca, extrínseca y pertinente, y sostienen que la reducción de la carga extrínseca mediante la segmentación del contenido libera recursos cognitivos para la comprensión. Fundamenta la organización del material en una idea por página.</w:t>
+      </w:r>
+    </w:p>
+    <w:p>
+      <w:pPr>
+        <w:pStyle w:val="BodyText"/>
+        <w:bidi w:val="0"/>
+        <w:spacing w:before="0" w:after="160"/>
+        <w:ind w:hanging="0" w:left="0" w:right="0"/>
+        <w:jc w:val="both"/>
+        <w:rPr/>
+      </w:pPr>
+      <w:r>
+        <w:rPr>
+          <w:b/>
+        </w:rPr>
+        <w:t>Zona de desarrollo próximo y andamiaje.</w:t>
+      </w:r>
+      <w:r>
+        <w:rPr/>
+        <w:t xml:space="preserve"> Vygotsky (1978) define la zona de desarrollo próximo como la distancia entre lo que el estudiante logra por sí mismo y lo que logra con asistencia. El andamiaje consiste en brindar esa asistencia de forma graduada y retirarla conforme el estudiante gana autonomía. Fundamenta el comportamiento del agente tutor.</w:t>
+      </w:r>
+    </w:p>
+    <w:p>
+      <w:pPr>
+        <w:pStyle w:val="BodyText"/>
+        <w:bidi w:val="0"/>
+        <w:spacing w:before="0" w:after="160"/>
+        <w:ind w:hanging="0" w:left="0" w:right="0"/>
+        <w:jc w:val="both"/>
+        <w:rPr/>
+      </w:pPr>
+      <w:r>
+        <w:rPr>
+          <w:b/>
+        </w:rPr>
+        <w:t>Modelos Extensos de Lenguaje e ingeniería de instrucciones.</w:t>
+      </w:r>
+      <w:r>
+        <w:rPr/>
+        <w:t xml:space="preserve"> Sistemas de inteligencia artificial generativa entrenados sobre grandes volúmenes de texto, cuyo comportamiento se condiciona mediante instrucciones y contexto. La ingeniería de instrucciones comprende las técnicas para acotar dicho comportamiento, relevantes aquí para impedir que el agente entregue respuestas directas o se desvíe del tema.</w:t>
+      </w:r>
+    </w:p>
+    <w:p>
+      <w:pPr>
+        <w:pStyle w:val="BodyText"/>
+        <w:bidi w:val="0"/>
+        <w:spacing w:before="0" w:after="160"/>
+        <w:ind w:hanging="0" w:left="0" w:right="0"/>
+        <w:jc w:val="both"/>
+        <w:rPr/>
+      </w:pPr>
+      <w:r>
+        <w:rPr>
+          <w:b/>
+        </w:rPr>
+        <w:t>Seguridad a nivel de filas (</w:t>
+      </w:r>
+      <w:r>
+        <w:rPr>
+          <w:b/>
+          <w:i/>
+        </w:rPr>
+        <w:t>Row-Level Security</w:t>
+      </w:r>
+      <w:r>
+        <w:rPr>
+          <w:b/>
+        </w:rPr>
+        <w:t>).</w:t>
+      </w:r>
+      <w:r>
+        <w:rPr/>
+        <w:t xml:space="preserve"> Mecanismo del motor de base de datos que restringe, mediante políticas declarativas, las filas que cada usuario autenticado puede leer o modificar. A diferencia de la validación en la capa de aplicación, opera aunque la consulta no provenga de la interfaz del sistema.</w:t>
       </w:r>
     </w:p>
     <w:p>
@@ -2002,170 +2184,342 @@
           <w:b/>
           <w:sz w:val="25"/>
         </w:rPr>
-        <w:t>Bases teóricas</w:t>
-      </w:r>
-    </w:p>
-    <w:p>
-      <w:pPr>
-        <w:pStyle w:val="BodyText"/>
-        <w:bidi w:val="0"/>
-        <w:spacing w:before="0" w:after="160"/>
-        <w:ind w:hanging="0" w:left="0" w:right="0"/>
-        <w:jc w:val="both"/>
-        <w:rPr/>
-      </w:pPr>
-      <w:r>
-        <w:rPr>
-          <w:b/>
-        </w:rPr>
-        <w:t>Aplicaciones Web Progresivas (PWA).</w:t>
-      </w:r>
-      <w:r>
-        <w:rPr/>
-        <w:t xml:space="preserve"> Modelo de desarrollo que permite a una aplicación web instalarse en el dispositivo, presentar un icono propio y operar con capacidades de almacenamiento local, sin requerir distribución por tiendas de aplicaciones. Se sustenta en tres elementos: el manifiesto de la aplicación, el trabajador de servicio (</w:t>
-      </w:r>
-      <w:r>
+        <w:t>Bases legales</w:t>
+      </w:r>
+    </w:p>
+    <w:p>
+      <w:pPr>
+        <w:pStyle w:val="BodyText"/>
+        <w:bidi w:val="0"/>
+        <w:spacing w:before="0" w:after="160"/>
+        <w:ind w:hanging="0" w:left="0" w:right="0"/>
+        <w:jc w:val="both"/>
+        <w:rPr/>
+      </w:pPr>
+      <w:r>
+        <w:rPr>
+          <w:b/>
+        </w:rPr>
+        <w:t>Constitución de la República Bolivariana de Venezuela (1999).</w:t>
+      </w:r>
+      <w:r>
+        <w:rPr/>
+        <w:t xml:space="preserve"> Los artículos 102 y 103 consagran la educación como derecho humano y deber social fundamental, y establecen el derecho de toda persona a una educación integral de calidad, lo que fundamenta la pertinencia social de toda iniciativa orientada a mejorar los procesos educativos.</w:t>
+      </w:r>
+    </w:p>
+    <w:p>
+      <w:pPr>
+        <w:pStyle w:val="BodyText"/>
+        <w:bidi w:val="0"/>
+        <w:spacing w:before="0" w:after="160"/>
+        <w:ind w:hanging="0" w:left="0" w:right="0"/>
+        <w:jc w:val="both"/>
+        <w:rPr/>
+      </w:pPr>
+      <w:r>
+        <w:rPr>
+          <w:b/>
+        </w:rPr>
+        <w:t>Ley Orgánica para la Protección de Niños, Niñas y Adolescentes (LOPNNA).</w:t>
+      </w:r>
+      <w:r>
+        <w:rPr/>
+        <w:t xml:space="preserve"> El artículo 65 consagra el derecho al honor, reputación, propia imagen, vida privada e intimidad familiar de niños, niñas y adolescentes. Esta disposición fundamenta directamente las medidas de protección de datos implementadas en el sistema, en particular el aislamiento de la información personal entre estudiantes y la restricción de su acceso al personal autorizado.</w:t>
+      </w:r>
+    </w:p>
+    <w:p>
+      <w:pPr>
+        <w:pStyle w:val="BodyText"/>
+        <w:bidi w:val="0"/>
+        <w:spacing w:before="0" w:after="160"/>
+        <w:ind w:hanging="0" w:left="0" w:right="0"/>
+        <w:jc w:val="both"/>
+        <w:rPr/>
+      </w:pPr>
+      <w:r>
+        <w:rPr>
+          <w:b/>
+        </w:rPr>
+        <w:t>Ley Orgánica de Educación (2009).</w:t>
+      </w:r>
+      <w:r>
+        <w:rPr/>
+        <w:t xml:space="preserve"> Establece los principios rectores del sistema educativo venezolano y el carácter público de la educación, marco en el que se inscribe el uso de herramientas tecnológicas de apoyo al proceso formativo.</w:t>
+      </w:r>
+    </w:p>
+    <w:p>
+      <w:pPr>
+        <w:pStyle w:val="BodyText"/>
+        <w:bidi w:val="0"/>
+        <w:spacing w:before="0" w:after="160"/>
+        <w:ind w:hanging="0" w:left="0" w:right="0"/>
+        <w:jc w:val="both"/>
+        <w:rPr/>
+      </w:pPr>
+      <w:r>
+        <w:rPr>
+          <w:b/>
+        </w:rPr>
+        <w:t>Ley de Infogobierno (2013).</w:t>
+      </w:r>
+      <w:r>
+        <w:rPr/>
+        <w:t xml:space="preserve"> Promueve el uso de tecnologías de información libres y estándares abiertos en el Estado venezolano, criterio atendido por la presente propuesta mediante la selección de tecnologías de código abierto.</w:t>
+      </w:r>
+    </w:p>
+    <w:p>
+      <w:pPr>
+        <w:pStyle w:val="BodyText"/>
+        <w:bidi w:val="0"/>
+        <w:spacing w:before="0" w:after="160"/>
+        <w:ind w:hanging="0" w:left="0" w:right="0"/>
+        <w:jc w:val="both"/>
+        <w:rPr/>
+      </w:pPr>
+      <w:r>
+        <w:rPr>
+          <w:b/>
+        </w:rPr>
+        <w:t>Ley Especial contra los Delitos Informáticos (2001).</w:t>
+      </w:r>
+      <w:r>
+        <w:rPr/>
+        <w:t xml:space="preserve"> Tipifica los delitos contra sistemas que utilicen tecnologías de información, incluido el acceso indebido a datos, lo que refuerza la obligación de implementar los controles de acceso descritos en la presente propuesta.</w:t>
+      </w:r>
+    </w:p>
+    <w:p>
+      <w:pPr>
+        <w:pStyle w:val="BodyText"/>
+        <w:bidi w:val="0"/>
+        <w:spacing w:before="0" w:after="160"/>
+        <w:ind w:hanging="0" w:left="0" w:right="0"/>
+        <w:jc w:val="both"/>
         <w:rPr>
           <w:i/>
         </w:rPr>
+      </w:pPr>
+      <w:r>
+        <w:rPr>
+          <w:i/>
+        </w:rPr>
+        <w:t>Nota para el proponente: verificar la vigencia y numeración de los artículos citados en la edición oficial de cada instrumento antes de la consignación definitiva.</w:t>
+      </w:r>
+    </w:p>
+    <w:p>
+      <w:pPr>
+        <w:pStyle w:val="BodyText"/>
+        <w:bidi w:val="0"/>
+        <w:spacing w:before="280" w:after="120"/>
+        <w:ind w:hanging="0" w:left="0" w:right="0"/>
+        <w:jc w:val="left"/>
+        <w:rPr>
+          <w:b/>
+          <w:sz w:val="25"/>
+        </w:rPr>
+      </w:pPr>
+      <w:r>
+        <w:rPr>
+          <w:b/>
+          <w:sz w:val="25"/>
+        </w:rPr>
+        <w:t>Glosario de términos</w:t>
+      </w:r>
+    </w:p>
+    <w:p>
+      <w:pPr>
+        <w:pStyle w:val="BodyText"/>
+        <w:bidi w:val="0"/>
+        <w:spacing w:before="0" w:after="160"/>
+        <w:ind w:hanging="0" w:left="0" w:right="0"/>
+        <w:jc w:val="both"/>
+        <w:rPr/>
+      </w:pPr>
+      <w:r>
+        <w:rPr>
+          <w:b/>
+        </w:rPr>
+        <w:t>Agente tutor:</w:t>
+      </w:r>
+      <w:r>
+        <w:rPr/>
+        <w:t xml:space="preserve"> componente de inteligencia artificial que asiste al estudiante durante la resolución de una actividad, sin entregar la respuesta.</w:t>
+      </w:r>
+    </w:p>
+    <w:p>
+      <w:pPr>
+        <w:pStyle w:val="BodyText"/>
+        <w:bidi w:val="0"/>
+        <w:spacing w:before="0" w:after="160"/>
+        <w:ind w:hanging="0" w:left="0" w:right="0"/>
+        <w:jc w:val="both"/>
+        <w:rPr/>
+      </w:pPr>
+      <w:r>
+        <w:rPr>
+          <w:b/>
+        </w:rPr>
+        <w:t>Aplicación Web Progresiva (PWA):</w:t>
+      </w:r>
+      <w:r>
+        <w:rPr/>
+        <w:t xml:space="preserve"> aplicación web instalable en el dispositivo del usuario, que ofrece una experiencia similar a la de una aplicación nativa sin requerir distribución por tiendas.</w:t>
+      </w:r>
+    </w:p>
+    <w:p>
+      <w:pPr>
+        <w:pStyle w:val="BodyText"/>
+        <w:bidi w:val="0"/>
+        <w:spacing w:before="0" w:after="160"/>
+        <w:ind w:hanging="0" w:left="0" w:right="0"/>
+        <w:jc w:val="both"/>
+        <w:rPr/>
+      </w:pPr>
+      <w:r>
+        <w:rPr>
+          <w:b/>
+        </w:rPr>
+        <w:t>Gamificación:</w:t>
+      </w:r>
+      <w:r>
+        <w:rPr/>
+        <w:t xml:space="preserve"> aplicación de elementos propios del juego en contextos ajenos al juego, con el fin de motivar la participación.</w:t>
+      </w:r>
+    </w:p>
+    <w:p>
+      <w:pPr>
+        <w:pStyle w:val="BodyText"/>
+        <w:bidi w:val="0"/>
+        <w:spacing w:before="0" w:after="160"/>
+        <w:ind w:hanging="0" w:left="0" w:right="0"/>
+        <w:jc w:val="both"/>
+        <w:rPr/>
+      </w:pPr>
+      <w:r>
+        <w:rPr>
+          <w:b/>
+        </w:rPr>
+        <w:t>Ingeniería de instrucciones (</w:t>
+      </w:r>
+      <w:r>
+        <w:rPr>
+          <w:b/>
+          <w:i/>
+        </w:rPr>
+        <w:t>prompt engineering</w:t>
+      </w:r>
+      <w:r>
+        <w:rPr>
+          <w:b/>
+        </w:rPr>
+        <w:t>):</w:t>
+      </w:r>
+      <w:r>
+        <w:rPr/>
+        <w:t xml:space="preserve"> conjunto de técnicas para formular las instrucciones que condicionan la respuesta de un modelo de lenguaje.</w:t>
+      </w:r>
+    </w:p>
+    <w:p>
+      <w:pPr>
+        <w:pStyle w:val="BodyText"/>
+        <w:bidi w:val="0"/>
+        <w:spacing w:before="0" w:after="160"/>
+        <w:ind w:hanging="0" w:left="0" w:right="0"/>
+        <w:jc w:val="both"/>
+        <w:rPr/>
+      </w:pPr>
+      <w:r>
+        <w:rPr>
+          <w:b/>
+        </w:rPr>
+        <w:t>Modelo Extenso de Lenguaje (LLM):</w:t>
+      </w:r>
+      <w:r>
+        <w:rPr/>
+        <w:t xml:space="preserve"> modelo de inteligencia artificial generativa capaz de producir texto a partir de una instrucción.</w:t>
+      </w:r>
+    </w:p>
+    <w:p>
+      <w:pPr>
+        <w:pStyle w:val="BodyText"/>
+        <w:bidi w:val="0"/>
+        <w:spacing w:before="0" w:after="160"/>
+        <w:ind w:hanging="0" w:left="0" w:right="0"/>
+        <w:jc w:val="both"/>
+        <w:rPr/>
+      </w:pPr>
+      <w:r>
+        <w:rPr>
+          <w:b/>
+        </w:rPr>
+        <w:t>Puntos de experiencia (XP):</w:t>
+      </w:r>
+      <w:r>
+        <w:rPr/>
+        <w:t xml:space="preserve"> unidad de medida del avance del estudiante dentro del entorno gamificado.</w:t>
+      </w:r>
+    </w:p>
+    <w:p>
+      <w:pPr>
+        <w:pStyle w:val="BodyText"/>
+        <w:bidi w:val="0"/>
+        <w:spacing w:before="0" w:after="160"/>
+        <w:ind w:hanging="0" w:left="0" w:right="0"/>
+        <w:jc w:val="both"/>
+        <w:rPr/>
+      </w:pPr>
+      <w:r>
+        <w:rPr>
+          <w:b/>
+        </w:rPr>
+        <w:t>Seguridad a nivel de filas (RLS):</w:t>
+      </w:r>
+      <w:r>
+        <w:rPr/>
+        <w:t xml:space="preserve"> política declarativa del motor de base de datos que determina qué filas puede ver o modificar cada usuario.</w:t>
+      </w:r>
+    </w:p>
+    <w:p>
+      <w:pPr>
+        <w:pStyle w:val="BodyText"/>
+        <w:bidi w:val="0"/>
+        <w:spacing w:before="0" w:after="160"/>
+        <w:ind w:hanging="0" w:left="0" w:right="0"/>
+        <w:jc w:val="both"/>
+        <w:rPr/>
+      </w:pPr>
+      <w:r>
+        <w:rPr>
+          <w:b/>
+        </w:rPr>
+        <w:t>Trabajador de servicio (</w:t>
+      </w:r>
+      <w:r>
+        <w:rPr>
+          <w:b/>
+          <w:i/>
+        </w:rPr>
         <w:t>service worker</w:t>
       </w:r>
       <w:r>
-        <w:rPr/>
-        <w:t>) y la entrega por conexión segura.</w:t>
-      </w:r>
-    </w:p>
-    <w:p>
-      <w:pPr>
-        <w:pStyle w:val="BodyText"/>
-        <w:bidi w:val="0"/>
-        <w:spacing w:before="0" w:after="160"/>
-        <w:ind w:hanging="0" w:left="0" w:right="0"/>
-        <w:jc w:val="both"/>
-        <w:rPr/>
-      </w:pPr>
-      <w:r>
-        <w:rPr>
-          <w:b/>
-        </w:rPr>
-        <w:t>Gamificación educativa.</w:t>
-      </w:r>
-      <w:r>
-        <w:rPr/>
-        <w:t xml:space="preserve"> Kapp (2012) la define como el uso de mecánicas, estética y pensamiento de juego para motivar la acción y promover el aprendizaje. En la presente propuesta se concreta en puntos de experiencia, progresión por niveles y tablas de clasificación.</w:t>
-      </w:r>
-    </w:p>
-    <w:p>
-      <w:pPr>
-        <w:pStyle w:val="BodyText"/>
-        <w:bidi w:val="0"/>
-        <w:spacing w:before="0" w:after="160"/>
-        <w:ind w:hanging="0" w:left="0" w:right="0"/>
-        <w:jc w:val="both"/>
-        <w:rPr/>
-      </w:pPr>
-      <w:r>
-        <w:rPr>
-          <w:b/>
-        </w:rPr>
-        <w:t>Teoría cognitiva del aprendizaje multimedia.</w:t>
-      </w:r>
-      <w:r>
-        <w:rPr/>
-        <w:t xml:space="preserve"> Mayer (2009) establece que el aprendizaje es más efectivo cuando la información verbal y la visual se presentan de forma integrada, y formula, entre otros, los principios de coherencia, señalización y contigüidad espacial, aplicados en el diseño del material de refuerzo de este sistema.</w:t>
-      </w:r>
-    </w:p>
-    <w:p>
-      <w:pPr>
-        <w:pStyle w:val="BodyText"/>
-        <w:bidi w:val="0"/>
-        <w:spacing w:before="0" w:after="160"/>
-        <w:ind w:hanging="0" w:left="0" w:right="0"/>
-        <w:jc w:val="both"/>
-        <w:rPr/>
-      </w:pPr>
-      <w:r>
-        <w:rPr>
-          <w:b/>
-        </w:rPr>
-        <w:t>Teoría de la carga cognitiva.</w:t>
-      </w:r>
-      <w:r>
-        <w:rPr/>
-        <w:t xml:space="preserve"> Sweller, Ayres y Kalyuga (2011) distinguen entre carga intrínseca, extrínseca y pertinente, y sostienen que la reducción de la carga extrínseca mediante la segmentación del contenido libera recursos cognitivos para la comprensión. Fundamenta la organización del material en una idea por página.</w:t>
-      </w:r>
-    </w:p>
-    <w:p>
-      <w:pPr>
-        <w:pStyle w:val="BodyText"/>
-        <w:bidi w:val="0"/>
-        <w:spacing w:before="0" w:after="160"/>
-        <w:ind w:hanging="0" w:left="0" w:right="0"/>
-        <w:jc w:val="both"/>
-        <w:rPr/>
-      </w:pPr>
-      <w:r>
-        <w:rPr>
-          <w:b/>
-        </w:rPr>
-        <w:t>Zona de desarrollo próximo y andamiaje.</w:t>
-      </w:r>
-      <w:r>
-        <w:rPr/>
-        <w:t xml:space="preserve"> Vygotsky (1978) define la zona de desarrollo próximo como la distancia entre lo que el estudiante logra por sí mismo y lo que logra con asistencia. El andamiaje consiste en brindar esa asistencia de forma graduada y retirarla conforme el estudiante gana autonomía. Fundamenta el comportamiento del agente tutor.</w:t>
-      </w:r>
-    </w:p>
-    <w:p>
-      <w:pPr>
-        <w:pStyle w:val="BodyText"/>
-        <w:bidi w:val="0"/>
-        <w:spacing w:before="0" w:after="160"/>
-        <w:ind w:hanging="0" w:left="0" w:right="0"/>
-        <w:jc w:val="both"/>
-        <w:rPr/>
-      </w:pPr>
-      <w:r>
-        <w:rPr>
-          <w:b/>
-        </w:rPr>
-        <w:t>Modelos Extensos de Lenguaje e ingeniería de instrucciones.</w:t>
-      </w:r>
-      <w:r>
-        <w:rPr/>
-        <w:t xml:space="preserve"> Sistemas de inteligencia artificial generativa entrenados sobre grandes volúmenes de texto, cuyo comportamiento se condiciona mediante instrucciones y contexto. La ingeniería de instrucciones comprende las técnicas para acotar dicho comportamiento, relevantes aquí para impedir que el agente entregue respuestas directas o se desvíe del tema.</w:t>
-      </w:r>
-    </w:p>
-    <w:p>
-      <w:pPr>
-        <w:pStyle w:val="BodyText"/>
-        <w:bidi w:val="0"/>
-        <w:spacing w:before="0" w:after="160"/>
-        <w:ind w:hanging="0" w:left="0" w:right="0"/>
-        <w:jc w:val="both"/>
-        <w:rPr/>
-      </w:pPr>
-      <w:r>
-        <w:rPr>
-          <w:b/>
-        </w:rPr>
-        <w:t>Seguridad a nivel de filas (</w:t>
-      </w:r>
-      <w:r>
-        <w:rPr>
-          <w:b/>
-          <w:i/>
-        </w:rPr>
-        <w:t>Row-Level Security</w:t>
-      </w:r>
-      <w:r>
-        <w:rPr>
-          <w:b/>
-        </w:rPr>
-        <w:t>).</w:t>
-      </w:r>
-      <w:r>
-        <w:rPr/>
-        <w:t xml:space="preserve"> Mecanismo del motor de base de datos que restringe, mediante políticas declarativas, las filas que cada usuario autenticado puede leer o modificar. A diferencia de la validación en la capa de aplicación, opera aunque la consulta no provenga de la interfaz del sistema.</w:t>
+        <w:rPr>
+          <w:b/>
+        </w:rPr>
+        <w:t>):</w:t>
+      </w:r>
+      <w:r>
+        <w:rPr/>
+        <w:t xml:space="preserve"> componente que se ejecuta en segundo plano en el navegador y habilita el almacenamiento local y la instalación de una aplicación web progresiva.</w:t>
+      </w:r>
+    </w:p>
+    <w:p>
+      <w:pPr>
+        <w:pStyle w:val="HorizontalLine"/>
+        <w:bidi w:val="0"/>
+        <w:jc w:val="left"/>
+        <w:rPr/>
+      </w:pPr>
+      <w:r>
+        <w:rPr/>
       </w:r>
     </w:p>
     <w:p>
@@ -2177,6 +2531,26 @@
         <w:jc w:val="left"/>
         <w:rPr>
           <w:b/>
+          <w:sz w:val="28"/>
+        </w:rPr>
+      </w:pPr>
+      <w:r>
+        <w:rPr>
+          <w:b/>
+          <w:sz w:val="28"/>
+        </w:rPr>
+        <w:t>METODOLOGÍA</w:t>
+      </w:r>
+    </w:p>
+    <w:p>
+      <w:pPr>
+        <w:pStyle w:val="BodyText"/>
+        <w:bidi w:val="0"/>
+        <w:spacing w:before="280" w:after="120"/>
+        <w:ind w:hanging="0" w:left="0" w:right="0"/>
+        <w:jc w:val="left"/>
+        <w:rPr>
+          <w:b/>
           <w:sz w:val="25"/>
         </w:rPr>
       </w:pPr>
@@ -2185,126 +2559,65 @@
           <w:b/>
           <w:sz w:val="25"/>
         </w:rPr>
-        <w:t>Bases legales</w:t>
-      </w:r>
-    </w:p>
-    <w:p>
-      <w:pPr>
-        <w:pStyle w:val="BodyText"/>
-        <w:bidi w:val="0"/>
-        <w:spacing w:before="0" w:after="160"/>
-        <w:ind w:hanging="0" w:left="0" w:right="0"/>
-        <w:jc w:val="both"/>
-        <w:rPr/>
-      </w:pPr>
-      <w:r>
-        <w:rPr>
-          <w:b/>
-        </w:rPr>
-        <w:t>Constitución de la República Bolivariana de Venezuela (1999).</w:t>
-      </w:r>
-      <w:r>
-        <w:rPr/>
-        <w:t xml:space="preserve"> Los artículos 102 y 103 consagran la educación como derecho humano y deber social fundamental, y establecen el derecho de toda persona a una educación integral de calidad, lo que fundamenta la pertinencia social de toda iniciativa orientada a mejorar los procesos educativos.</w:t>
-      </w:r>
-    </w:p>
-    <w:p>
-      <w:pPr>
-        <w:pStyle w:val="BodyText"/>
-        <w:bidi w:val="0"/>
-        <w:spacing w:before="0" w:after="160"/>
-        <w:ind w:hanging="0" w:left="0" w:right="0"/>
-        <w:jc w:val="both"/>
-        <w:rPr/>
-      </w:pPr>
-      <w:r>
-        <w:rPr>
-          <w:b/>
-        </w:rPr>
-        <w:t>Ley Orgánica para la Protección de Niños, Niñas y Adolescentes (LOPNNA).</w:t>
-      </w:r>
-      <w:r>
-        <w:rPr/>
-        <w:t xml:space="preserve"> El artículo 65 consagra el derecho al honor, reputación, propia imagen, vida privada e intimidad familiar de niños, niñas y adolescentes. Esta disposición fundamenta directamente las medidas de protección de datos implementadas en el sistema, en particular el aislamiento de la información personal entre estudiantes y la restricción de su acceso al personal autorizado.</w:t>
-      </w:r>
-    </w:p>
-    <w:p>
-      <w:pPr>
-        <w:pStyle w:val="BodyText"/>
-        <w:bidi w:val="0"/>
-        <w:spacing w:before="0" w:after="160"/>
-        <w:ind w:hanging="0" w:left="0" w:right="0"/>
-        <w:jc w:val="both"/>
-        <w:rPr/>
-      </w:pPr>
-      <w:r>
-        <w:rPr>
-          <w:b/>
-        </w:rPr>
-        <w:t>Ley Orgánica de Educación (2009).</w:t>
-      </w:r>
-      <w:r>
-        <w:rPr/>
-        <w:t xml:space="preserve"> Establece los principios rectores del sistema educativo venezolano y el carácter público de la educación, marco en el que se inscribe el uso de herramientas tecnológicas de apoyo al proceso formativo.</w:t>
-      </w:r>
-    </w:p>
-    <w:p>
-      <w:pPr>
-        <w:pStyle w:val="BodyText"/>
-        <w:bidi w:val="0"/>
-        <w:spacing w:before="0" w:after="160"/>
-        <w:ind w:hanging="0" w:left="0" w:right="0"/>
-        <w:jc w:val="both"/>
-        <w:rPr/>
-      </w:pPr>
-      <w:r>
-        <w:rPr>
-          <w:b/>
-        </w:rPr>
-        <w:t>Ley de Infogobierno (2013).</w:t>
-      </w:r>
-      <w:r>
-        <w:rPr/>
-        <w:t xml:space="preserve"> Promueve el uso de tecnologías de información libres y estándares abiertos en el Estado venezolano, criterio atendido por la presente propuesta mediante la selección de tecnologías de código abierto.</w:t>
-      </w:r>
-    </w:p>
-    <w:p>
-      <w:pPr>
-        <w:pStyle w:val="BodyText"/>
-        <w:bidi w:val="0"/>
-        <w:spacing w:before="0" w:after="160"/>
-        <w:ind w:hanging="0" w:left="0" w:right="0"/>
-        <w:jc w:val="both"/>
-        <w:rPr/>
-      </w:pPr>
-      <w:r>
-        <w:rPr>
-          <w:b/>
-        </w:rPr>
-        <w:t>Ley Especial contra los Delitos Informáticos (2001).</w:t>
-      </w:r>
-      <w:r>
-        <w:rPr/>
-        <w:t xml:space="preserve"> Tipifica los delitos contra sistemas que utilicen tecnologías de información, incluido el acceso indebido a datos, lo que refuerza la obligación de implementar los controles de acceso descritos en la presente propuesta.</w:t>
-      </w:r>
-    </w:p>
-    <w:p>
-      <w:pPr>
-        <w:pStyle w:val="BodyText"/>
-        <w:bidi w:val="0"/>
-        <w:spacing w:before="0" w:after="160"/>
-        <w:ind w:hanging="0" w:left="0" w:right="0"/>
-        <w:jc w:val="both"/>
-        <w:rPr>
-          <w:i/>
-          <w:i/>
-        </w:rPr>
-      </w:pPr>
-      <w:r>
-        <w:rPr>
-          <w:i/>
-        </w:rPr>
-        <w:t>Nota para el proponente: verificar la vigencia y numeración de los artículos citados en la edición oficial de cada instrumento antes de la consignación definitiva.</w:t>
+        <w:t>Tipo de investigación</w:t>
+      </w:r>
+    </w:p>
+    <w:p>
+      <w:pPr>
+        <w:pStyle w:val="BodyText"/>
+        <w:bidi w:val="0"/>
+        <w:spacing w:before="0" w:after="160"/>
+        <w:ind w:hanging="0" w:left="0" w:right="0"/>
+        <w:jc w:val="both"/>
+        <w:rPr/>
+      </w:pPr>
+      <w:r>
+        <w:rPr/>
+        <w:t xml:space="preserve">La presente investigación es de tipo </w:t>
+      </w:r>
+      <w:r>
+        <w:rPr>
+          <w:b/>
+        </w:rPr>
+        <w:t>aplicada</w:t>
+      </w:r>
+      <w:r>
+        <w:rPr/>
+        <w:t xml:space="preserve">, por cuanto se orienta a la resolución de un problema concreto y verificado en una institución determinada, mediante la construcción de un producto de software. Su </w:t>
+      </w:r>
+      <w:r>
+        <w:rPr>
+          <w:b/>
+        </w:rPr>
+        <w:t>nivel es descriptivo</w:t>
+      </w:r>
+      <w:r>
+        <w:rPr/>
+        <w:t>, ya que caracteriza la situación actual de los procesos objeto de estudio antes de intervenir sobre ellos.</w:t>
+      </w:r>
+    </w:p>
+    <w:p>
+      <w:pPr>
+        <w:pStyle w:val="BodyText"/>
+        <w:bidi w:val="0"/>
+        <w:spacing w:before="0" w:after="160"/>
+        <w:ind w:hanging="0" w:left="0" w:right="0"/>
+        <w:jc w:val="both"/>
+        <w:rPr/>
+      </w:pPr>
+      <w:r>
+        <w:rPr/>
+        <w:t xml:space="preserve">Se inscribe en la modalidad de </w:t>
+      </w:r>
+      <w:r>
+        <w:rPr>
+          <w:b/>
+        </w:rPr>
+        <w:t>Proyecto Factible</w:t>
+      </w:r>
+      <w:r>
+        <w:rPr/>
+        <w:t>, definida por el Manual de Trabajos de Grado de la Universidad Pedagógica Experimental Libertador (UPEL, 2016) como la elaboración de una propuesta viable destinada a atender necesidades de una organización o grupo social, sustentada en una base teórica y en un diagnóstico previo.</w:t>
       </w:r>
     </w:p>
     <w:p>
@@ -2324,233 +2637,40 @@
           <w:b/>
           <w:sz w:val="25"/>
         </w:rPr>
-        <w:t>Glosario de términos</w:t>
-      </w:r>
-    </w:p>
-    <w:p>
-      <w:pPr>
-        <w:pStyle w:val="BodyText"/>
-        <w:bidi w:val="0"/>
-        <w:spacing w:before="0" w:after="160"/>
-        <w:ind w:hanging="0" w:left="0" w:right="0"/>
-        <w:jc w:val="both"/>
-        <w:rPr/>
-      </w:pPr>
-      <w:r>
-        <w:rPr>
-          <w:b/>
-        </w:rPr>
-        <w:t>Agente tutor:</w:t>
-      </w:r>
-      <w:r>
-        <w:rPr/>
-        <w:t xml:space="preserve"> componente de inteligencia artificial que asiste al estudiante durante la resolución de una actividad, sin entregar la respuesta.</w:t>
-      </w:r>
-    </w:p>
-    <w:p>
-      <w:pPr>
-        <w:pStyle w:val="BodyText"/>
-        <w:bidi w:val="0"/>
-        <w:spacing w:before="0" w:after="160"/>
-        <w:ind w:hanging="0" w:left="0" w:right="0"/>
-        <w:jc w:val="both"/>
-        <w:rPr/>
-      </w:pPr>
-      <w:r>
-        <w:rPr>
-          <w:b/>
-        </w:rPr>
-        <w:t>Aplicación Web Progresiva (PWA):</w:t>
-      </w:r>
-      <w:r>
-        <w:rPr/>
-        <w:t xml:space="preserve"> aplicación web instalable en el dispositivo del usuario, que ofrece una experiencia similar a la de una aplicación nativa sin requerir distribución por tiendas.</w:t>
-      </w:r>
-    </w:p>
-    <w:p>
-      <w:pPr>
-        <w:pStyle w:val="BodyText"/>
-        <w:bidi w:val="0"/>
-        <w:spacing w:before="0" w:after="160"/>
-        <w:ind w:hanging="0" w:left="0" w:right="0"/>
-        <w:jc w:val="both"/>
-        <w:rPr/>
-      </w:pPr>
-      <w:r>
-        <w:rPr>
-          <w:b/>
-        </w:rPr>
-        <w:t>Gamificación:</w:t>
-      </w:r>
-      <w:r>
-        <w:rPr/>
-        <w:t xml:space="preserve"> aplicación de elementos propios del juego en contextos ajenos al juego, con el fin de motivar la participación.</w:t>
-      </w:r>
-    </w:p>
-    <w:p>
-      <w:pPr>
-        <w:pStyle w:val="BodyText"/>
-        <w:bidi w:val="0"/>
-        <w:spacing w:before="0" w:after="160"/>
-        <w:ind w:hanging="0" w:left="0" w:right="0"/>
-        <w:jc w:val="both"/>
-        <w:rPr/>
-      </w:pPr>
-      <w:r>
-        <w:rPr>
-          <w:b/>
-        </w:rPr>
-        <w:t>Ingeniería de instrucciones (</w:t>
-      </w:r>
-      <w:r>
-        <w:rPr>
-          <w:b/>
-          <w:i/>
-        </w:rPr>
-        <w:t>prompt engineering</w:t>
-      </w:r>
-      <w:r>
-        <w:rPr>
-          <w:b/>
-        </w:rPr>
-        <w:t>):</w:t>
-      </w:r>
-      <w:r>
-        <w:rPr/>
-        <w:t xml:space="preserve"> conjunto de técnicas para formular las instrucciones que condicionan la respuesta de un modelo de lenguaje.</w:t>
-      </w:r>
-    </w:p>
-    <w:p>
-      <w:pPr>
-        <w:pStyle w:val="BodyText"/>
-        <w:bidi w:val="0"/>
-        <w:spacing w:before="0" w:after="160"/>
-        <w:ind w:hanging="0" w:left="0" w:right="0"/>
-        <w:jc w:val="both"/>
-        <w:rPr/>
-      </w:pPr>
-      <w:r>
-        <w:rPr>
-          <w:b/>
-        </w:rPr>
-        <w:t>Modelo Extenso de Lenguaje (LLM):</w:t>
-      </w:r>
-      <w:r>
-        <w:rPr/>
-        <w:t xml:space="preserve"> modelo de inteligencia artificial generativa capaz de producir texto a partir de una instrucción.</w:t>
-      </w:r>
-    </w:p>
-    <w:p>
-      <w:pPr>
-        <w:pStyle w:val="BodyText"/>
-        <w:bidi w:val="0"/>
-        <w:spacing w:before="0" w:after="160"/>
-        <w:ind w:hanging="0" w:left="0" w:right="0"/>
-        <w:jc w:val="both"/>
-        <w:rPr/>
-      </w:pPr>
-      <w:r>
-        <w:rPr>
-          <w:b/>
-        </w:rPr>
-        <w:t>Puntos de experiencia (XP):</w:t>
-      </w:r>
-      <w:r>
-        <w:rPr/>
-        <w:t xml:space="preserve"> unidad de medida del avance del estudiante dentro del entorno gamificado.</w:t>
-      </w:r>
-    </w:p>
-    <w:p>
-      <w:pPr>
-        <w:pStyle w:val="BodyText"/>
-        <w:bidi w:val="0"/>
-        <w:spacing w:before="0" w:after="160"/>
-        <w:ind w:hanging="0" w:left="0" w:right="0"/>
-        <w:jc w:val="both"/>
-        <w:rPr/>
-      </w:pPr>
-      <w:r>
-        <w:rPr>
-          <w:b/>
-        </w:rPr>
-        <w:t>Seguridad a nivel de filas (RLS):</w:t>
-      </w:r>
-      <w:r>
-        <w:rPr/>
-        <w:t xml:space="preserve"> política declarativa del motor de base de datos que determina qué filas puede ver o modificar cada usuario.</w:t>
-      </w:r>
-    </w:p>
-    <w:p>
-      <w:pPr>
-        <w:pStyle w:val="BodyText"/>
-        <w:bidi w:val="0"/>
-        <w:spacing w:before="0" w:after="160"/>
-        <w:ind w:hanging="0" w:left="0" w:right="0"/>
-        <w:jc w:val="both"/>
-        <w:rPr/>
-      </w:pPr>
-      <w:r>
-        <w:rPr>
-          <w:b/>
-        </w:rPr>
-        <w:t>Trabajador de servicio (</w:t>
-      </w:r>
-      <w:r>
-        <w:rPr>
-          <w:b/>
-          <w:i/>
-        </w:rPr>
-        <w:t>service worker</w:t>
-      </w:r>
-      <w:r>
-        <w:rPr>
-          <w:b/>
-        </w:rPr>
-        <w:t>):</w:t>
-      </w:r>
-      <w:r>
-        <w:rPr/>
-        <w:t xml:space="preserve"> componente que se ejecuta en segundo plano en el navegador y habilita el almacenamiento local y la instalación de una aplicación web progresiva.</w:t>
-      </w:r>
-    </w:p>
-    <w:p>
-      <w:pPr>
-        <w:pStyle w:val="HorizontalLine"/>
-        <w:bidi w:val="0"/>
+        <w:t>Diseño de la investigación</w:t>
+      </w:r>
+    </w:p>
+    <w:p>
+      <w:pPr>
+        <w:pStyle w:val="BodyText"/>
+        <w:bidi w:val="0"/>
+        <w:spacing w:before="0" w:after="160"/>
+        <w:ind w:hanging="0" w:left="0" w:right="0"/>
+        <w:jc w:val="both"/>
+        <w:rPr/>
+      </w:pPr>
+      <w:r>
+        <w:rPr/>
+        <w:t xml:space="preserve">El diseño es </w:t>
+      </w:r>
+      <w:r>
+        <w:rPr>
+          <w:b/>
+        </w:rPr>
+        <w:t>de campo y no experimental</w:t>
+      </w:r>
+      <w:r>
+        <w:rPr/>
+        <w:t>. De campo, porque los datos del diagnóstico se recolectan directamente de la realidad donde ocurren los hechos, mediante observación y entrevistas al personal de la institución. No experimental, porque no se manipulan deliberadamente las variables: se observan los procesos en su contexto natural para luego proponer la solución informática.</w:t>
+      </w:r>
+    </w:p>
+    <w:p>
+      <w:pPr>
+        <w:pStyle w:val="BodyText"/>
+        <w:bidi w:val="0"/>
+        <w:spacing w:before="280" w:after="120"/>
+        <w:ind w:hanging="0" w:left="0" w:right="0"/>
         <w:jc w:val="left"/>
-        <w:rPr/>
-      </w:pPr>
-      <w:r>
-        <w:rPr/>
-      </w:r>
-    </w:p>
-    <w:p>
-      <w:pPr>
-        <w:pStyle w:val="BodyText"/>
-        <w:bidi w:val="0"/>
-        <w:spacing w:before="280" w:after="120"/>
-        <w:ind w:hanging="0" w:left="0" w:right="0"/>
-        <w:jc w:val="left"/>
-        <w:rPr>
-          <w:b/>
-          <w:sz w:val="28"/>
-        </w:rPr>
-      </w:pPr>
-      <w:r>
-        <w:rPr>
-          <w:b/>
-          <w:sz w:val="28"/>
-        </w:rPr>
-        <w:t>METODOLOGÍA</w:t>
-      </w:r>
-    </w:p>
-    <w:p>
-      <w:pPr>
-        <w:pStyle w:val="BodyText"/>
-        <w:bidi w:val="0"/>
-        <w:spacing w:before="280" w:after="120"/>
-        <w:ind w:hanging="0" w:left="0" w:right="0"/>
-        <w:jc w:val="left"/>
         <w:rPr>
           <w:b/>
           <w:sz w:val="25"/>
@@ -2561,128 +2681,6 @@
           <w:b/>
           <w:sz w:val="25"/>
         </w:rPr>
-        <w:t>Tipo de investigación</w:t>
-      </w:r>
-    </w:p>
-    <w:p>
-      <w:pPr>
-        <w:pStyle w:val="BodyText"/>
-        <w:bidi w:val="0"/>
-        <w:spacing w:before="0" w:after="160"/>
-        <w:ind w:hanging="0" w:left="0" w:right="0"/>
-        <w:jc w:val="both"/>
-        <w:rPr/>
-      </w:pPr>
-      <w:r>
-        <w:rPr/>
-        <w:t xml:space="preserve">La presente investigación es de tipo </w:t>
-      </w:r>
-      <w:r>
-        <w:rPr>
-          <w:b/>
-        </w:rPr>
-        <w:t>aplicada</w:t>
-      </w:r>
-      <w:r>
-        <w:rPr/>
-        <w:t xml:space="preserve">, por cuanto se orienta a la resolución de un problema concreto y verificado en una institución determinada, mediante la construcción de un producto de software. Su </w:t>
-      </w:r>
-      <w:r>
-        <w:rPr>
-          <w:b/>
-        </w:rPr>
-        <w:t>nivel es descriptivo</w:t>
-      </w:r>
-      <w:r>
-        <w:rPr/>
-        <w:t>, ya que caracteriza la situación actual de los procesos objeto de estudio antes de intervenir sobre ellos.</w:t>
-      </w:r>
-    </w:p>
-    <w:p>
-      <w:pPr>
-        <w:pStyle w:val="BodyText"/>
-        <w:bidi w:val="0"/>
-        <w:spacing w:before="0" w:after="160"/>
-        <w:ind w:hanging="0" w:left="0" w:right="0"/>
-        <w:jc w:val="both"/>
-        <w:rPr/>
-      </w:pPr>
-      <w:r>
-        <w:rPr/>
-        <w:t xml:space="preserve">Se inscribe en la modalidad de </w:t>
-      </w:r>
-      <w:r>
-        <w:rPr>
-          <w:b/>
-        </w:rPr>
-        <w:t>Proyecto Factible</w:t>
-      </w:r>
-      <w:r>
-        <w:rPr/>
-        <w:t>, definida por el Manual de Trabajos de Grado de la Universidad Pedagógica Experimental Libertador (UPEL, 2016) como la elaboración de una propuesta viable destinada a atender necesidades de una organización o grupo social, sustentada en una base teórica y en un diagnóstico previo.</w:t>
-      </w:r>
-    </w:p>
-    <w:p>
-      <w:pPr>
-        <w:pStyle w:val="BodyText"/>
-        <w:bidi w:val="0"/>
-        <w:spacing w:before="280" w:after="120"/>
-        <w:ind w:hanging="0" w:left="0" w:right="0"/>
-        <w:jc w:val="left"/>
-        <w:rPr>
-          <w:b/>
-          <w:sz w:val="25"/>
-        </w:rPr>
-      </w:pPr>
-      <w:r>
-        <w:rPr>
-          <w:b/>
-          <w:sz w:val="25"/>
-        </w:rPr>
-        <w:t>Diseño de la investigación</w:t>
-      </w:r>
-    </w:p>
-    <w:p>
-      <w:pPr>
-        <w:pStyle w:val="BodyText"/>
-        <w:bidi w:val="0"/>
-        <w:spacing w:before="0" w:after="160"/>
-        <w:ind w:hanging="0" w:left="0" w:right="0"/>
-        <w:jc w:val="both"/>
-        <w:rPr/>
-      </w:pPr>
-      <w:r>
-        <w:rPr/>
-        <w:t xml:space="preserve">El diseño es </w:t>
-      </w:r>
-      <w:r>
-        <w:rPr>
-          <w:b/>
-        </w:rPr>
-        <w:t>de campo y no experimental</w:t>
-      </w:r>
-      <w:r>
-        <w:rPr/>
-        <w:t>. De campo, porque los datos del diagnóstico se recolectan directamente de la realidad donde ocurren los hechos, mediante observación y entrevistas al personal de la institución. No experimental, porque no se manipulan deliberadamente las variables: se observan los procesos en su contexto natural para luego proponer la solución informática.</w:t>
-      </w:r>
-    </w:p>
-    <w:p>
-      <w:pPr>
-        <w:pStyle w:val="BodyText"/>
-        <w:bidi w:val="0"/>
-        <w:spacing w:before="280" w:after="120"/>
-        <w:ind w:hanging="0" w:left="0" w:right="0"/>
-        <w:jc w:val="left"/>
-        <w:rPr>
-          <w:b/>
-          <w:sz w:val="25"/>
-        </w:rPr>
-      </w:pPr>
-      <w:r>
-        <w:rPr>
-          <w:b/>
-          <w:sz w:val="25"/>
-        </w:rPr>
         <w:t>Población y muestra</w:t>
       </w:r>
     </w:p>
@@ -2714,7 +2712,6 @@
         <w:ind w:hanging="0" w:left="0" w:right="0"/>
         <w:jc w:val="both"/>
         <w:rPr>
-          <w:i/>
           <w:i/>
         </w:rPr>
       </w:pPr>
@@ -2809,15 +2806,15 @@
         </w:tblCellMar>
       </w:tblPr>
       <w:tblGrid>
-        <w:gridCol w:w="2609"/>
+        <w:gridCol w:w="2610"/>
         <w:gridCol w:w="3085"/>
-        <w:gridCol w:w="2243"/>
+        <w:gridCol w:w="2242"/>
       </w:tblGrid>
       <w:tr>
         <w:trPr/>
         <w:tc>
           <w:tcPr>
-            <w:tcW w:w="2609" w:type="dxa"/>
+            <w:tcW w:w="2610" w:type="dxa"/>
             <w:tcBorders>
               <w:top w:val="single" w:sz="6" w:space="0" w:color="808080"/>
               <w:left w:val="single" w:sz="6" w:space="0" w:color="808080"/>
@@ -2867,7 +2864,7 @@
         </w:tc>
         <w:tc>
           <w:tcPr>
-            <w:tcW w:w="2243" w:type="dxa"/>
+            <w:tcW w:w="2242" w:type="dxa"/>
             <w:tcBorders>
               <w:top w:val="single" w:sz="6" w:space="0" w:color="808080"/>
               <w:left w:val="single" w:sz="2" w:space="0" w:color="808080"/>
@@ -2895,7 +2892,7 @@
         <w:trPr/>
         <w:tc>
           <w:tcPr>
-            <w:tcW w:w="2609" w:type="dxa"/>
+            <w:tcW w:w="2610" w:type="dxa"/>
             <w:tcBorders>
               <w:left w:val="single" w:sz="6" w:space="0" w:color="808080"/>
               <w:bottom w:val="single" w:sz="2" w:space="0" w:color="808080"/>
@@ -2945,7 +2942,7 @@
         </w:tc>
         <w:tc>
           <w:tcPr>
-            <w:tcW w:w="2243" w:type="dxa"/>
+            <w:tcW w:w="2242" w:type="dxa"/>
             <w:tcBorders>
               <w:left w:val="single" w:sz="2" w:space="0" w:color="808080"/>
               <w:bottom w:val="single" w:sz="2" w:space="0" w:color="808080"/>
@@ -2973,7 +2970,7 @@
         <w:trPr/>
         <w:tc>
           <w:tcPr>
-            <w:tcW w:w="2609" w:type="dxa"/>
+            <w:tcW w:w="2610" w:type="dxa"/>
             <w:tcBorders>
               <w:left w:val="single" w:sz="6" w:space="0" w:color="808080"/>
               <w:bottom w:val="single" w:sz="2" w:space="0" w:color="808080"/>
@@ -3023,7 +3020,7 @@
         </w:tc>
         <w:tc>
           <w:tcPr>
-            <w:tcW w:w="2243" w:type="dxa"/>
+            <w:tcW w:w="2242" w:type="dxa"/>
             <w:tcBorders>
               <w:left w:val="single" w:sz="2" w:space="0" w:color="808080"/>
               <w:bottom w:val="single" w:sz="2" w:space="0" w:color="808080"/>
@@ -3051,7 +3048,7 @@
         <w:trPr/>
         <w:tc>
           <w:tcPr>
-            <w:tcW w:w="2609" w:type="dxa"/>
+            <w:tcW w:w="2610" w:type="dxa"/>
             <w:tcBorders>
               <w:left w:val="single" w:sz="6" w:space="0" w:color="808080"/>
               <w:bottom w:val="single" w:sz="2" w:space="0" w:color="808080"/>
@@ -3101,7 +3098,7 @@
         </w:tc>
         <w:tc>
           <w:tcPr>
-            <w:tcW w:w="2243" w:type="dxa"/>
+            <w:tcW w:w="2242" w:type="dxa"/>
             <w:tcBorders>
               <w:left w:val="single" w:sz="2" w:space="0" w:color="808080"/>
               <w:bottom w:val="single" w:sz="2" w:space="0" w:color="808080"/>
@@ -3129,7 +3126,7 @@
         <w:trPr/>
         <w:tc>
           <w:tcPr>
-            <w:tcW w:w="2609" w:type="dxa"/>
+            <w:tcW w:w="2610" w:type="dxa"/>
             <w:tcBorders>
               <w:left w:val="single" w:sz="6" w:space="0" w:color="808080"/>
               <w:bottom w:val="single" w:sz="2" w:space="0" w:color="808080"/>
@@ -3179,7 +3176,7 @@
         </w:tc>
         <w:tc>
           <w:tcPr>
-            <w:tcW w:w="2243" w:type="dxa"/>
+            <w:tcW w:w="2242" w:type="dxa"/>
             <w:tcBorders>
               <w:left w:val="single" w:sz="2" w:space="0" w:color="808080"/>
               <w:bottom w:val="single" w:sz="2" w:space="0" w:color="808080"/>
@@ -3207,7 +3204,7 @@
         <w:trPr/>
         <w:tc>
           <w:tcPr>
-            <w:tcW w:w="2609" w:type="dxa"/>
+            <w:tcW w:w="2610" w:type="dxa"/>
             <w:tcBorders>
               <w:left w:val="single" w:sz="6" w:space="0" w:color="808080"/>
               <w:bottom w:val="single" w:sz="6" w:space="0" w:color="808080"/>
@@ -3257,7 +3254,7 @@
         </w:tc>
         <w:tc>
           <w:tcPr>
-            <w:tcW w:w="2243" w:type="dxa"/>
+            <w:tcW w:w="2242" w:type="dxa"/>
             <w:tcBorders>
               <w:left w:val="single" w:sz="2" w:space="0" w:color="808080"/>
               <w:bottom w:val="single" w:sz="6" w:space="0" w:color="808080"/>
@@ -3683,15 +3680,15 @@
         </w:tblCellMar>
       </w:tblPr>
       <w:tblGrid>
-        <w:gridCol w:w="650"/>
+        <w:gridCol w:w="651"/>
         <w:gridCol w:w="4125"/>
-        <w:gridCol w:w="1093"/>
+        <w:gridCol w:w="1092"/>
       </w:tblGrid>
       <w:tr>
         <w:trPr/>
         <w:tc>
           <w:tcPr>
-            <w:tcW w:w="650" w:type="dxa"/>
+            <w:tcW w:w="651" w:type="dxa"/>
             <w:tcBorders>
               <w:top w:val="single" w:sz="6" w:space="0" w:color="808080"/>
               <w:left w:val="single" w:sz="6" w:space="0" w:color="808080"/>
@@ -3741,7 +3738,7 @@
         </w:tc>
         <w:tc>
           <w:tcPr>
-            <w:tcW w:w="1093" w:type="dxa"/>
+            <w:tcW w:w="1092" w:type="dxa"/>
             <w:tcBorders>
               <w:top w:val="single" w:sz="6" w:space="0" w:color="808080"/>
               <w:left w:val="single" w:sz="2" w:space="0" w:color="808080"/>
@@ -3769,7 +3766,7 @@
         <w:trPr/>
         <w:tc>
           <w:tcPr>
-            <w:tcW w:w="650" w:type="dxa"/>
+            <w:tcW w:w="651" w:type="dxa"/>
             <w:tcBorders>
               <w:left w:val="single" w:sz="6" w:space="0" w:color="808080"/>
               <w:bottom w:val="single" w:sz="2" w:space="0" w:color="808080"/>
@@ -3819,7 +3816,7 @@
         </w:tc>
         <w:tc>
           <w:tcPr>
-            <w:tcW w:w="1093" w:type="dxa"/>
+            <w:tcW w:w="1092" w:type="dxa"/>
             <w:tcBorders>
               <w:left w:val="single" w:sz="2" w:space="0" w:color="808080"/>
               <w:bottom w:val="single" w:sz="2" w:space="0" w:color="808080"/>
@@ -3847,7 +3844,7 @@
         <w:trPr/>
         <w:tc>
           <w:tcPr>
-            <w:tcW w:w="650" w:type="dxa"/>
+            <w:tcW w:w="651" w:type="dxa"/>
             <w:tcBorders>
               <w:left w:val="single" w:sz="6" w:space="0" w:color="808080"/>
               <w:bottom w:val="single" w:sz="2" w:space="0" w:color="808080"/>
@@ -3897,7 +3894,7 @@
         </w:tc>
         <w:tc>
           <w:tcPr>
-            <w:tcW w:w="1093" w:type="dxa"/>
+            <w:tcW w:w="1092" w:type="dxa"/>
             <w:tcBorders>
               <w:left w:val="single" w:sz="2" w:space="0" w:color="808080"/>
               <w:bottom w:val="single" w:sz="2" w:space="0" w:color="808080"/>
@@ -3925,7 +3922,7 @@
         <w:trPr/>
         <w:tc>
           <w:tcPr>
-            <w:tcW w:w="650" w:type="dxa"/>
+            <w:tcW w:w="651" w:type="dxa"/>
             <w:tcBorders>
               <w:left w:val="single" w:sz="6" w:space="0" w:color="808080"/>
               <w:bottom w:val="single" w:sz="2" w:space="0" w:color="808080"/>
@@ -3975,7 +3972,7 @@
         </w:tc>
         <w:tc>
           <w:tcPr>
-            <w:tcW w:w="1093" w:type="dxa"/>
+            <w:tcW w:w="1092" w:type="dxa"/>
             <w:tcBorders>
               <w:left w:val="single" w:sz="2" w:space="0" w:color="808080"/>
               <w:bottom w:val="single" w:sz="2" w:space="0" w:color="808080"/>
@@ -4003,7 +4000,7 @@
         <w:trPr/>
         <w:tc>
           <w:tcPr>
-            <w:tcW w:w="650" w:type="dxa"/>
+            <w:tcW w:w="651" w:type="dxa"/>
             <w:tcBorders>
               <w:left w:val="single" w:sz="6" w:space="0" w:color="808080"/>
               <w:bottom w:val="single" w:sz="2" w:space="0" w:color="808080"/>
@@ -4053,7 +4050,7 @@
         </w:tc>
         <w:tc>
           <w:tcPr>
-            <w:tcW w:w="1093" w:type="dxa"/>
+            <w:tcW w:w="1092" w:type="dxa"/>
             <w:tcBorders>
               <w:left w:val="single" w:sz="2" w:space="0" w:color="808080"/>
               <w:bottom w:val="single" w:sz="2" w:space="0" w:color="808080"/>
@@ -4081,7 +4078,7 @@
         <w:trPr/>
         <w:tc>
           <w:tcPr>
-            <w:tcW w:w="650" w:type="dxa"/>
+            <w:tcW w:w="651" w:type="dxa"/>
             <w:tcBorders>
               <w:left w:val="single" w:sz="6" w:space="0" w:color="808080"/>
               <w:bottom w:val="single" w:sz="2" w:space="0" w:color="808080"/>
@@ -4131,7 +4128,7 @@
         </w:tc>
         <w:tc>
           <w:tcPr>
-            <w:tcW w:w="1093" w:type="dxa"/>
+            <w:tcW w:w="1092" w:type="dxa"/>
             <w:tcBorders>
               <w:left w:val="single" w:sz="2" w:space="0" w:color="808080"/>
               <w:bottom w:val="single" w:sz="2" w:space="0" w:color="808080"/>
@@ -4159,7 +4156,7 @@
         <w:trPr/>
         <w:tc>
           <w:tcPr>
-            <w:tcW w:w="650" w:type="dxa"/>
+            <w:tcW w:w="651" w:type="dxa"/>
             <w:tcBorders>
               <w:left w:val="single" w:sz="6" w:space="0" w:color="808080"/>
               <w:bottom w:val="single" w:sz="6" w:space="0" w:color="808080"/>
@@ -4209,7 +4206,7 @@
         </w:tc>
         <w:tc>
           <w:tcPr>
-            <w:tcW w:w="1093" w:type="dxa"/>
+            <w:tcW w:w="1092" w:type="dxa"/>
             <w:tcBorders>
               <w:left w:val="single" w:sz="2" w:space="0" w:color="808080"/>
               <w:bottom w:val="single" w:sz="6" w:space="0" w:color="808080"/>
@@ -4638,7 +4635,7 @@
       </w:tblPr>
       <w:tblGrid>
         <w:gridCol w:w="4024"/>
-        <w:gridCol w:w="3912"/>
+        <w:gridCol w:w="3913"/>
       </w:tblGrid>
       <w:tr>
         <w:trPr/>
@@ -4669,7 +4666,7 @@
         </w:tc>
         <w:tc>
           <w:tcPr>
-            <w:tcW w:w="3912" w:type="dxa"/>
+            <w:tcW w:w="3913" w:type="dxa"/>
             <w:tcBorders>
               <w:top w:val="single" w:sz="6" w:space="0" w:color="808080"/>
               <w:left w:val="single" w:sz="2" w:space="0" w:color="808080"/>
@@ -4722,7 +4719,7 @@
         </w:tc>
         <w:tc>
           <w:tcPr>
-            <w:tcW w:w="3912" w:type="dxa"/>
+            <w:tcW w:w="3913" w:type="dxa"/>
             <w:tcBorders>
               <w:left w:val="single" w:sz="2" w:space="0" w:color="808080"/>
               <w:bottom w:val="single" w:sz="2" w:space="0" w:color="808080"/>
@@ -4775,7 +4772,7 @@
         </w:tc>
         <w:tc>
           <w:tcPr>
-            <w:tcW w:w="3912" w:type="dxa"/>
+            <w:tcW w:w="3913" w:type="dxa"/>
             <w:tcBorders>
               <w:left w:val="single" w:sz="2" w:space="0" w:color="808080"/>
               <w:bottom w:val="single" w:sz="6" w:space="0" w:color="808080"/>
@@ -4855,7 +4852,7 @@
       </w:pPr>
       <w:r>
         <w:rPr/>
-        <w:t>Los datos visibles pertenecen a cuentas de prueba creadas expresamente para la verificación del sistema. Esta decisión no es accesoria: la Ley Orgánica para la Protección de Niños, Niñas y Adolescentes, invocada en las bases legales de esta propuesta, protege la imagen y la intimidad de los estudiantes, de modo que ningún nombre ni dato de un menor real aparece en este documento.</w:t>
+        <w:t>Los datos visibles pertenecen a cuentas de prueba creadas expresamente para la verificación del sistema. Esta decisión no es accesoria: la Ley Orgánica para la Protección de Niños, Niñas y Adolescentes, invocada en las bases legales de esta propuesta, protege la imagen y la intimidad de los estudiantes, de modo que ningún nombre ni dato de un menor aparece en este documento.</w:t>
       </w:r>
     </w:p>
     <w:p>
@@ -4971,21 +4968,21 @@
           <w:b/>
           <w:sz w:val="28"/>
         </w:rPr>
-        <w:t>A.2. Módulo del docente</w:t>
-      </w:r>
-    </w:p>
-    <w:p>
-      <w:pPr>
-        <w:pStyle w:val="BodyText"/>
-        <w:bidi w:val="0"/>
-        <w:spacing w:before="0" w:after="160"/>
-        <w:ind w:hanging="0" w:left="0" w:right="0"/>
-        <w:jc w:val="both"/>
-        <w:rPr/>
-      </w:pPr>
-      <w:r>
-        <w:rPr/>
-        <w:t>Las pantallas de esta sección corresponden al objetivo específico 4, en lo relativo a los módulos de gestión académica y de elaboración de material ilustrado.</w:t>
+        <w:t>A.2. Módulo de coordinación</w:t>
+      </w:r>
+    </w:p>
+    <w:p>
+      <w:pPr>
+        <w:pStyle w:val="BodyText"/>
+        <w:bidi w:val="0"/>
+        <w:spacing w:before="0" w:after="160"/>
+        <w:ind w:hanging="0" w:left="0" w:right="0"/>
+        <w:jc w:val="both"/>
+        <w:rPr/>
+      </w:pPr>
+      <w:r>
+        <w:rPr/>
+        <w:t>Las pantallas de esta sección corresponden al objetivo específico 4, en lo relativo al módulo de gestión académica.</w:t>
       </w:r>
     </w:p>
     <w:p>
@@ -5001,7 +4998,7 @@
         <w:rPr/>
         <w:drawing>
           <wp:inline distT="0" distB="0" distL="0" distR="0">
-            <wp:extent cx="5039995" cy="17145000"/>
+            <wp:extent cx="5039995" cy="6838950"/>
             <wp:effectExtent l="0" t="0" r="0" b="0"/>
             <wp:docPr id="2" name="Image2" descr=""/>
             <wp:cNvGraphicFramePr>
@@ -5025,7 +5022,7 @@
                   <pic:spPr bwMode="auto">
                     <a:xfrm>
                       <a:off x="0" y="0"/>
-                      <a:ext cx="5039995" cy="17145000"/>
+                      <a:ext cx="5039995" cy="6838950"/>
                     </a:xfrm>
                     <a:prstGeom prst="rect">
                       <a:avLst/>
@@ -5061,7 +5058,7 @@
         <w:rPr>
           <w:sz w:val="20"/>
         </w:rPr>
-        <w:t xml:space="preserve"> Tablero del docente. Reúne la matrícula del salón, los estudiantes sin actividad reciente, la clasificación por puntos de experiencia y el porcentaje de avance de cada actividad asignada. Sustituye la consulta manual de registros dispersos por un único punto de lectura.</w:t>
+        <w:t xml:space="preserve"> Panel de coordinación. Concentra los indicadores de la institución —matrícula activa, salones abiertos, docentes registrados y año escolar en curso— junto con la distribución de estudiantes por sección. Sustituye la consulta de registros dispersos por una lectura única del estado del plantel.</w:t>
       </w:r>
     </w:p>
     <w:p>
@@ -5077,7 +5074,7 @@
         <w:rPr/>
         <w:drawing>
           <wp:inline distT="0" distB="0" distL="0" distR="0">
-            <wp:extent cx="5039995" cy="5581650"/>
+            <wp:extent cx="5039995" cy="8591550"/>
             <wp:effectExtent l="0" t="0" r="0" b="0"/>
             <wp:docPr id="3" name="Image3" descr=""/>
             <wp:cNvGraphicFramePr>
@@ -5101,7 +5098,7 @@
                   <pic:spPr bwMode="auto">
                     <a:xfrm>
                       <a:off x="0" y="0"/>
-                      <a:ext cx="5039995" cy="5581650"/>
+                      <a:ext cx="5039995" cy="8591550"/>
                     </a:xfrm>
                     <a:prstGeom prst="rect">
                       <a:avLst/>
@@ -5137,7 +5134,7 @@
         <w:rPr>
           <w:sz w:val="20"/>
         </w:rPr>
-        <w:t xml:space="preserve"> Registro del salón. Cada estudiante presenta su nivel alcanzado, su total de puntos de experiencia, la fecha de su última actividad y su estado de participación. Es el instrumento que permite al docente identificar el rezago antes de la evaluación sumativa.</w:t>
+        <w:t xml:space="preserve"> Administración de salones. Cada sección muestra el grado, el docente responsable y su matrícula activa. Desde esta pantalla la coordinación abre secciones y asigna docentes, operaciones reservadas a este rol por las políticas de seguridad de la base de datos.</w:t>
       </w:r>
     </w:p>
     <w:p>
@@ -5153,7 +5150,7 @@
         <w:rPr/>
         <w:drawing>
           <wp:inline distT="0" distB="0" distL="0" distR="0">
-            <wp:extent cx="2089785" cy="6810375"/>
+            <wp:extent cx="5039995" cy="7696200"/>
             <wp:effectExtent l="0" t="0" r="0" b="0"/>
             <wp:docPr id="4" name="Image4" descr=""/>
             <wp:cNvGraphicFramePr>
@@ -5177,7 +5174,7 @@
                   <pic:spPr bwMode="auto">
                     <a:xfrm>
                       <a:off x="0" y="0"/>
-                      <a:ext cx="2089785" cy="6810375"/>
+                      <a:ext cx="5039995" cy="7696200"/>
                     </a:xfrm>
                     <a:prstGeom prst="rect">
                       <a:avLst/>
@@ -5213,7 +5210,41 @@
         <w:rPr>
           <w:sz w:val="20"/>
         </w:rPr>
-        <w:t xml:space="preserve"> Listado de actividades del salón, con su estado de publicación y el avance del grupo en cada una.</w:t>
+        <w:t xml:space="preserve"> Administración de docentes, con el salón asignado a cada uno y su estado de actividad. La desactivación de una cuenta es potestad exclusiva de coordinación: un disparador en la base de datos impide que un docente o un estudiante altere su propio rol o el de otro, incluso si la petición no proviene de la interfaz del sistema.</w:t>
+      </w:r>
+    </w:p>
+    <w:p>
+      <w:pPr>
+        <w:pStyle w:val="BodyText"/>
+        <w:bidi w:val="0"/>
+        <w:spacing w:before="280" w:after="120"/>
+        <w:ind w:hanging="0" w:left="0" w:right="0"/>
+        <w:jc w:val="left"/>
+        <w:rPr>
+          <w:b/>
+          <w:sz w:val="28"/>
+        </w:rPr>
+      </w:pPr>
+      <w:r>
+        <w:rPr>
+          <w:b/>
+          <w:sz w:val="28"/>
+        </w:rPr>
+        <w:t>A.3. Módulo del docente</w:t>
+      </w:r>
+    </w:p>
+    <w:p>
+      <w:pPr>
+        <w:pStyle w:val="BodyText"/>
+        <w:bidi w:val="0"/>
+        <w:spacing w:before="0" w:after="160"/>
+        <w:ind w:hanging="0" w:left="0" w:right="0"/>
+        <w:jc w:val="both"/>
+        <w:rPr/>
+      </w:pPr>
+      <w:r>
+        <w:rPr/>
+        <w:t>Las pantallas de esta sección corresponden al objetivo específico 4, en lo relativo a los módulos de gestión del salón y de elaboración de material ilustrado.</w:t>
       </w:r>
     </w:p>
     <w:p>
@@ -5289,7 +5320,7 @@
         <w:rPr>
           <w:sz w:val="20"/>
         </w:rPr>
-        <w:t xml:space="preserve"> Catálogo de lecciones por área de conocimiento. El sistema informa cuántos temas del grado cuentan ya con material de refuerzo elaborado, de modo que el docente identifica de inmediato los vacíos por cubrir.</w:t>
+        <w:t xml:space="preserve"> Tablero del docente. Reúne la matrícula del salón, los estudiantes sin actividad reciente, la clasificación por puntos de experiencia y el porcentaje de avance de cada actividad asignada.</w:t>
       </w:r>
     </w:p>
     <w:p>
@@ -5305,7 +5336,7 @@
         <w:rPr/>
         <w:drawing>
           <wp:inline distT="0" distB="0" distL="0" distR="0">
-            <wp:extent cx="5039995" cy="17145000"/>
+            <wp:extent cx="5039995" cy="5581650"/>
             <wp:effectExtent l="0" t="0" r="0" b="0"/>
             <wp:docPr id="6" name="Image6" descr=""/>
             <wp:cNvGraphicFramePr>
@@ -5329,7 +5360,7 @@
                   <pic:spPr bwMode="auto">
                     <a:xfrm>
                       <a:off x="0" y="0"/>
-                      <a:ext cx="5039995" cy="17145000"/>
+                      <a:ext cx="5039995" cy="5581650"/>
                     </a:xfrm>
                     <a:prstGeom prst="rect">
                       <a:avLst/>
@@ -5365,7 +5396,7 @@
         <w:rPr>
           <w:sz w:val="20"/>
         </w:rPr>
-        <w:t xml:space="preserve"> Editor de lección. El material se organiza en páginas de una sola idea, conforme al principio de segmentación de la teoría de la carga cognitiva expuesto en las bases teóricas. Cada página admite título, texto e ilustración.</w:t>
+        <w:t xml:space="preserve"> Registro del salón. Cada estudiante presenta su nivel alcanzado, su total de puntos de experiencia, la fecha de su última actividad y su estado de participación. Es el instrumento que permite al docente identificar el rezago antes de la evaluación sumativa.</w:t>
       </w:r>
     </w:p>
     <w:p>
@@ -5381,7 +5412,7 @@
         <w:rPr/>
         <w:drawing>
           <wp:inline distT="0" distB="0" distL="0" distR="0">
-            <wp:extent cx="5039995" cy="12973050"/>
+            <wp:extent cx="5039995" cy="17145000"/>
             <wp:effectExtent l="0" t="0" r="0" b="0"/>
             <wp:docPr id="7" name="Image7" descr=""/>
             <wp:cNvGraphicFramePr>
@@ -5405,7 +5436,7 @@
                   <pic:spPr bwMode="auto">
                     <a:xfrm>
                       <a:off x="0" y="0"/>
-                      <a:ext cx="5039995" cy="12973050"/>
+                      <a:ext cx="5039995" cy="17145000"/>
                     </a:xfrm>
                     <a:prstGeom prst="rect">
                       <a:avLst/>
@@ -5441,41 +5472,7 @@
         <w:rPr>
           <w:sz w:val="20"/>
         </w:rPr>
-        <w:t xml:space="preserve"> Editor gráfico de escenas, componente central del módulo de elaboración de material de refuerzo. Integra un catálogo de ciento treinta y una piezas ilustradas agrupadas en catorce categorías, herramientas de trazo libre, texto y flechas, fondos predefinidos y un asistente de inteligencia artificial que dispone los elementos a partir de una instrucción en lenguaje natural. La salida del asistente se limita a componentes del catálogo y es validada por el sistema antes de aplicarse; la autoría del material permanece en el docente.</w:t>
-      </w:r>
-    </w:p>
-    <w:p>
-      <w:pPr>
-        <w:pStyle w:val="BodyText"/>
-        <w:bidi w:val="0"/>
-        <w:spacing w:before="280" w:after="120"/>
-        <w:ind w:hanging="0" w:left="0" w:right="0"/>
-        <w:jc w:val="left"/>
-        <w:rPr>
-          <w:b/>
-          <w:sz w:val="28"/>
-        </w:rPr>
-      </w:pPr>
-      <w:r>
-        <w:rPr>
-          <w:b/>
-          <w:sz w:val="28"/>
-        </w:rPr>
-        <w:t>A.3. Módulo del estudiante</w:t>
-      </w:r>
-    </w:p>
-    <w:p>
-      <w:pPr>
-        <w:pStyle w:val="BodyText"/>
-        <w:bidi w:val="0"/>
-        <w:spacing w:before="0" w:after="160"/>
-        <w:ind w:hanging="0" w:left="0" w:right="0"/>
-        <w:jc w:val="both"/>
-        <w:rPr/>
-      </w:pPr>
-      <w:r>
-        <w:rPr/>
-        <w:t>Las pantallas de esta sección corresponden al objetivo específico 4, en lo relativo al módulo de aprendizaje gamificado.</w:t>
+        <w:t xml:space="preserve"> Listado de actividades del salón, con su estado de publicación y el avance del grupo en cada una.</w:t>
       </w:r>
     </w:p>
     <w:p>
@@ -5551,7 +5548,7 @@
         <w:rPr>
           <w:sz w:val="20"/>
         </w:rPr>
-        <w:t xml:space="preserve"> Tablero del estudiante. El avance académico se representa como la reparación progresiva de una nave: cada componente se desbloquea al completar actividades. La barra superior muestra el nivel alcanzado y la energía estelar acumulada, denominación que reciben los puntos de experiencia en la interfaz dirigida al niño.</w:t>
+        <w:t xml:space="preserve"> Catálogo de lecciones por área de conocimiento. El sistema informa cuántos temas del grado cuentan ya con material de refuerzo elaborado, de modo que el docente identifica de inmediato los vacíos por cubrir.</w:t>
       </w:r>
     </w:p>
     <w:p>
@@ -5627,7 +5624,7 @@
         <w:rPr>
           <w:sz w:val="20"/>
         </w:rPr>
-        <w:t xml:space="preserve"> Listado de misiones asignadas al estudiante, con su estado de avance.</w:t>
+        <w:t xml:space="preserve"> Editor de lección. El material se organiza en páginas de una sola idea, conforme al principio de segmentación de la teoría de la carga cognitiva expuesto en las bases teóricas. Cada página admite título, texto e ilustración.</w:t>
       </w:r>
     </w:p>
     <w:p>
@@ -5643,7 +5640,7 @@
         <w:rPr/>
         <w:drawing>
           <wp:inline distT="0" distB="0" distL="0" distR="0">
-            <wp:extent cx="5039995" cy="17145000"/>
+            <wp:extent cx="5039995" cy="12973050"/>
             <wp:effectExtent l="0" t="0" r="0" b="0"/>
             <wp:docPr id="10" name="Image10" descr=""/>
             <wp:cNvGraphicFramePr>
@@ -5667,6 +5664,116 @@
                   <pic:spPr bwMode="auto">
                     <a:xfrm>
                       <a:off x="0" y="0"/>
+                      <a:ext cx="5039995" cy="12973050"/>
+                    </a:xfrm>
+                    <a:prstGeom prst="rect">
+                      <a:avLst/>
+                    </a:prstGeom>
+                    <a:noFill/>
+                  </pic:spPr>
+                </pic:pic>
+              </a:graphicData>
+            </a:graphic>
+          </wp:inline>
+        </w:drawing>
+      </w:r>
+    </w:p>
+    <w:p>
+      <w:pPr>
+        <w:pStyle w:val="BodyText"/>
+        <w:bidi w:val="0"/>
+        <w:spacing w:before="120" w:after="283"/>
+        <w:ind w:hanging="0" w:left="320" w:right="320"/>
+        <w:jc w:val="center"/>
+        <w:rPr>
+          <w:sz w:val="20"/>
+        </w:rPr>
+      </w:pPr>
+      <w:r>
+        <w:rPr>
+          <w:b/>
+          <w:sz w:val="20"/>
+        </w:rPr>
+        <w:t>Figura 10.</w:t>
+      </w:r>
+      <w:r>
+        <w:rPr>
+          <w:sz w:val="20"/>
+        </w:rPr>
+        <w:t xml:space="preserve"> Editor gráfico de escenas, componente central del módulo de elaboración de material de refuerzo. Integra un catálogo de ciento treinta y una piezas ilustradas agrupadas en catorce categorías, herramientas de trazo libre, texto y flechas, fondos predefinidos y un asistente de inteligencia artificial que dispone los elementos a partir de una instrucción en lenguaje natural. La salida del asistente se limita a componentes del catálogo y es validada por el sistema antes de aplicarse; la autoría del material permanece en el docente.</w:t>
+      </w:r>
+    </w:p>
+    <w:p>
+      <w:pPr>
+        <w:pStyle w:val="BodyText"/>
+        <w:bidi w:val="0"/>
+        <w:spacing w:before="280" w:after="120"/>
+        <w:ind w:hanging="0" w:left="0" w:right="0"/>
+        <w:jc w:val="left"/>
+        <w:rPr>
+          <w:b/>
+          <w:sz w:val="28"/>
+        </w:rPr>
+      </w:pPr>
+      <w:r>
+        <w:rPr>
+          <w:b/>
+          <w:sz w:val="28"/>
+        </w:rPr>
+        <w:t>A.4. Módulo del estudiante</w:t>
+      </w:r>
+    </w:p>
+    <w:p>
+      <w:pPr>
+        <w:pStyle w:val="BodyText"/>
+        <w:bidi w:val="0"/>
+        <w:spacing w:before="0" w:after="160"/>
+        <w:ind w:hanging="0" w:left="0" w:right="0"/>
+        <w:jc w:val="both"/>
+        <w:rPr/>
+      </w:pPr>
+      <w:r>
+        <w:rPr/>
+        <w:t>Las pantallas de esta sección corresponden al objetivo específico 4, en lo relativo al módulo de aprendizaje gamificado.</w:t>
+      </w:r>
+    </w:p>
+    <w:p>
+      <w:pPr>
+        <w:pStyle w:val="BodyText"/>
+        <w:bidi w:val="0"/>
+        <w:spacing w:before="320" w:after="320"/>
+        <w:ind w:hanging="0" w:left="320" w:right="320"/>
+        <w:jc w:val="center"/>
+        <w:rPr/>
+      </w:pPr>
+      <w:r>
+        <w:rPr/>
+        <w:drawing>
+          <wp:inline distT="0" distB="0" distL="0" distR="0">
+            <wp:extent cx="5039995" cy="17145000"/>
+            <wp:effectExtent l="0" t="0" r="0" b="0"/>
+            <wp:docPr id="11" name="Image11" descr=""/>
+            <wp:cNvGraphicFramePr>
+              <a:graphicFrameLocks xmlns:a="http://schemas.openxmlformats.org/drawingml/2006/main" noChangeAspect="1"/>
+            </wp:cNvGraphicFramePr>
+            <a:graphic xmlns:a="http://schemas.openxmlformats.org/drawingml/2006/main">
+              <a:graphicData uri="http://schemas.openxmlformats.org/drawingml/2006/picture">
+                <pic:pic xmlns:pic="http://schemas.openxmlformats.org/drawingml/2006/picture">
+                  <pic:nvPicPr>
+                    <pic:cNvPr id="11" name="Image11" descr=""/>
+                    <pic:cNvPicPr>
+                      <a:picLocks noChangeAspect="1" noChangeArrowheads="1"/>
+                    </pic:cNvPicPr>
+                  </pic:nvPicPr>
+                  <pic:blipFill>
+                    <a:blip r:embed="rId12"/>
+                    <a:stretch>
+                      <a:fillRect/>
+                    </a:stretch>
+                  </pic:blipFill>
+                  <pic:spPr bwMode="auto">
+                    <a:xfrm>
+                      <a:off x="0" y="0"/>
                       <a:ext cx="5039995" cy="17145000"/>
                     </a:xfrm>
                     <a:prstGeom prst="rect">
@@ -5697,7 +5804,159 @@
           <w:b/>
           <w:sz w:val="20"/>
         </w:rPr>
-        <w:t>Figura 10.</w:t>
+        <w:t>Figura 11.</w:t>
+      </w:r>
+      <w:r>
+        <w:rPr>
+          <w:sz w:val="20"/>
+        </w:rPr>
+        <w:t xml:space="preserve"> Tablero del estudiante. El avance académico se representa como la reparación progresiva de una nave: cada componente se desbloquea al completar actividades. La barra superior muestra el nivel alcanzado y la energía estelar acumulada, denominación que reciben los puntos de experiencia en la interfaz dirigida al niño.</w:t>
+      </w:r>
+    </w:p>
+    <w:p>
+      <w:pPr>
+        <w:pStyle w:val="BodyText"/>
+        <w:bidi w:val="0"/>
+        <w:spacing w:before="320" w:after="320"/>
+        <w:ind w:hanging="0" w:left="320" w:right="320"/>
+        <w:jc w:val="center"/>
+        <w:rPr/>
+      </w:pPr>
+      <w:r>
+        <w:rPr/>
+        <w:drawing>
+          <wp:inline distT="0" distB="0" distL="0" distR="0">
+            <wp:extent cx="5039995" cy="17145000"/>
+            <wp:effectExtent l="0" t="0" r="0" b="0"/>
+            <wp:docPr id="12" name="Image12" descr=""/>
+            <wp:cNvGraphicFramePr>
+              <a:graphicFrameLocks xmlns:a="http://schemas.openxmlformats.org/drawingml/2006/main" noChangeAspect="1"/>
+            </wp:cNvGraphicFramePr>
+            <a:graphic xmlns:a="http://schemas.openxmlformats.org/drawingml/2006/main">
+              <a:graphicData uri="http://schemas.openxmlformats.org/drawingml/2006/picture">
+                <pic:pic xmlns:pic="http://schemas.openxmlformats.org/drawingml/2006/picture">
+                  <pic:nvPicPr>
+                    <pic:cNvPr id="12" name="Image12" descr=""/>
+                    <pic:cNvPicPr>
+                      <a:picLocks noChangeAspect="1" noChangeArrowheads="1"/>
+                    </pic:cNvPicPr>
+                  </pic:nvPicPr>
+                  <pic:blipFill>
+                    <a:blip r:embed="rId13"/>
+                    <a:stretch>
+                      <a:fillRect/>
+                    </a:stretch>
+                  </pic:blipFill>
+                  <pic:spPr bwMode="auto">
+                    <a:xfrm>
+                      <a:off x="0" y="0"/>
+                      <a:ext cx="5039995" cy="17145000"/>
+                    </a:xfrm>
+                    <a:prstGeom prst="rect">
+                      <a:avLst/>
+                    </a:prstGeom>
+                    <a:noFill/>
+                  </pic:spPr>
+                </pic:pic>
+              </a:graphicData>
+            </a:graphic>
+          </wp:inline>
+        </w:drawing>
+      </w:r>
+    </w:p>
+    <w:p>
+      <w:pPr>
+        <w:pStyle w:val="BodyText"/>
+        <w:bidi w:val="0"/>
+        <w:spacing w:before="120" w:after="283"/>
+        <w:ind w:hanging="0" w:left="320" w:right="320"/>
+        <w:jc w:val="center"/>
+        <w:rPr>
+          <w:sz w:val="20"/>
+        </w:rPr>
+      </w:pPr>
+      <w:r>
+        <w:rPr>
+          <w:b/>
+          <w:sz w:val="20"/>
+        </w:rPr>
+        <w:t>Figura 12.</w:t>
+      </w:r>
+      <w:r>
+        <w:rPr>
+          <w:sz w:val="20"/>
+        </w:rPr>
+        <w:t xml:space="preserve"> Listado de misiones asignadas al estudiante, con su estado de avance.</w:t>
+      </w:r>
+    </w:p>
+    <w:p>
+      <w:pPr>
+        <w:pStyle w:val="BodyText"/>
+        <w:bidi w:val="0"/>
+        <w:spacing w:before="320" w:after="320"/>
+        <w:ind w:hanging="0" w:left="320" w:right="320"/>
+        <w:jc w:val="center"/>
+        <w:rPr/>
+      </w:pPr>
+      <w:r>
+        <w:rPr/>
+        <w:drawing>
+          <wp:inline distT="0" distB="0" distL="0" distR="0">
+            <wp:extent cx="5039995" cy="17145000"/>
+            <wp:effectExtent l="0" t="0" r="0" b="0"/>
+            <wp:docPr id="13" name="Image13" descr=""/>
+            <wp:cNvGraphicFramePr>
+              <a:graphicFrameLocks xmlns:a="http://schemas.openxmlformats.org/drawingml/2006/main" noChangeAspect="1"/>
+            </wp:cNvGraphicFramePr>
+            <a:graphic xmlns:a="http://schemas.openxmlformats.org/drawingml/2006/main">
+              <a:graphicData uri="http://schemas.openxmlformats.org/drawingml/2006/picture">
+                <pic:pic xmlns:pic="http://schemas.openxmlformats.org/drawingml/2006/picture">
+                  <pic:nvPicPr>
+                    <pic:cNvPr id="13" name="Image13" descr=""/>
+                    <pic:cNvPicPr>
+                      <a:picLocks noChangeAspect="1" noChangeArrowheads="1"/>
+                    </pic:cNvPicPr>
+                  </pic:nvPicPr>
+                  <pic:blipFill>
+                    <a:blip r:embed="rId14"/>
+                    <a:stretch>
+                      <a:fillRect/>
+                    </a:stretch>
+                  </pic:blipFill>
+                  <pic:spPr bwMode="auto">
+                    <a:xfrm>
+                      <a:off x="0" y="0"/>
+                      <a:ext cx="5039995" cy="17145000"/>
+                    </a:xfrm>
+                    <a:prstGeom prst="rect">
+                      <a:avLst/>
+                    </a:prstGeom>
+                    <a:noFill/>
+                  </pic:spPr>
+                </pic:pic>
+              </a:graphicData>
+            </a:graphic>
+          </wp:inline>
+        </w:drawing>
+      </w:r>
+    </w:p>
+    <w:p>
+      <w:pPr>
+        <w:pStyle w:val="BodyText"/>
+        <w:bidi w:val="0"/>
+        <w:spacing w:before="120" w:after="283"/>
+        <w:ind w:hanging="0" w:left="320" w:right="320"/>
+        <w:jc w:val="center"/>
+        <w:rPr>
+          <w:sz w:val="20"/>
+        </w:rPr>
+      </w:pPr>
+      <w:r>
+        <w:rPr>
+          <w:b/>
+          <w:sz w:val="20"/>
+        </w:rPr>
+        <w:t>Figura 13.</w:t>
       </w:r>
       <w:r>
         <w:rPr>
@@ -6496,15 +6755,12 @@
     <w:qFormat/>
     <w:pPr>
       <w:widowControl w:val="false"/>
-      <w:suppressAutoHyphens w:val="true"/>
       <w:bidi w:val="0"/>
-      <w:spacing w:lineRule="auto" w:line="360" w:before="0" w:after="0"/>
-      <w:jc w:val="left"/>
+      <w:spacing w:lineRule="auto" w:line="360"/>
     </w:pPr>
     <w:rPr>
       <w:rFonts w:ascii="Times New Roman;serif" w:hAnsi="Times New Roman;serif" w:eastAsia="Times New Roman;serif" w:cs="Times New Roman;serif"/>
       <w:color w:val="auto"/>
-      <w:kern w:val="0"/>
       <w:sz w:val="24"/>
       <w:szCs w:val="24"/>
       <w:lang w:val="es-VE" w:eastAsia="zh-CN" w:bidi="hi-IN"/>
@@ -6523,22 +6779,8 @@
       <w:szCs w:val="48"/>
     </w:rPr>
   </w:style>
-  <w:style w:type="character" w:styleId="EndnoteCharacters">
-    <w:name w:val="Endnote Characters"/>
-    <w:qFormat/>
-    <w:rPr>
-      <w:vertAlign w:val="superscript"/>
-    </w:rPr>
-  </w:style>
   <w:style w:type="character" w:styleId="EndnoteReference">
     <w:name w:val="endnote reference"/>
-    <w:rPr>
-      <w:vertAlign w:val="superscript"/>
-    </w:rPr>
-  </w:style>
-  <w:style w:type="character" w:styleId="FootnoteCharacters">
-    <w:name w:val="Footnote Characters"/>
-    <w:qFormat/>
     <w:rPr>
       <w:vertAlign w:val="superscript"/>
     </w:rPr>
@@ -6549,13 +6791,13 @@
       <w:vertAlign w:val="superscript"/>
     </w:rPr>
   </w:style>
-  <w:style w:type="character" w:styleId="EndnoteCharactersuser">
-    <w:name w:val="Endnote Characters (user)"/>
+  <w:style w:type="character" w:styleId="EndnoteCharacters">
+    <w:name w:val="Endnote Characters"/>
     <w:qFormat/>
     <w:rPr/>
   </w:style>
-  <w:style w:type="character" w:styleId="FootnoteCharactersuser">
-    <w:name w:val="Footnote Characters (user)"/>
+  <w:style w:type="character" w:styleId="FootnoteCharacters">
+    <w:name w:val="Footnote Characters"/>
     <w:qFormat/>
     <w:rPr/>
   </w:style>
@@ -6571,69 +6813,11 @@
     <w:qFormat/>
     <w:rPr/>
   </w:style>
-  <w:style w:type="character" w:styleId="Bulletsuser">
-    <w:name w:val="Bullets (user)"/>
+  <w:style w:type="character" w:styleId="Bullets">
+    <w:name w:val="Bullets"/>
     <w:qFormat/>
     <w:rPr>
       <w:rFonts w:ascii="OpenSymbol" w:hAnsi="OpenSymbol" w:eastAsia="OpenSymbol" w:cs="OpenSymbol"/>
-    </w:rPr>
-  </w:style>
-  <w:style w:type="paragraph" w:styleId="Heading">
-    <w:name w:val="Heading"/>
-    <w:basedOn w:val="Normal"/>
-    <w:next w:val="BodyText"/>
-    <w:qFormat/>
-    <w:pPr>
-      <w:keepNext w:val="true"/>
-      <w:spacing w:before="240" w:after="283"/>
-    </w:pPr>
-    <w:rPr>
-      <w:rFonts w:ascii="Liberation Sans" w:hAnsi="Liberation Sans"/>
-      <w:sz w:val="28"/>
-      <w:szCs w:val="28"/>
-    </w:rPr>
-  </w:style>
-  <w:style w:type="paragraph" w:styleId="BodyText">
-    <w:name w:val="Body Text"/>
-    <w:basedOn w:val="Normal"/>
-    <w:pPr>
-      <w:spacing w:before="0" w:after="283"/>
-    </w:pPr>
-    <w:rPr/>
-  </w:style>
-  <w:style w:type="paragraph" w:styleId="List">
-    <w:name w:val="List"/>
-    <w:basedOn w:val="BodyText"/>
-    <w:pPr/>
-    <w:rPr>
-      <w:rFonts w:cs="Noto Sans Devanagari"/>
-    </w:rPr>
-  </w:style>
-  <w:style w:type="paragraph" w:styleId="Caption">
-    <w:name w:val="caption"/>
-    <w:basedOn w:val="Normal"/>
-    <w:qFormat/>
-    <w:pPr>
-      <w:suppressLineNumbers/>
-      <w:spacing w:before="120" w:after="120"/>
-    </w:pPr>
-    <w:rPr>
-      <w:rFonts w:cs="Noto Sans Devanagari"/>
-      <w:i/>
-      <w:iCs/>
-      <w:sz w:val="24"/>
-      <w:szCs w:val="24"/>
-    </w:rPr>
-  </w:style>
-  <w:style w:type="paragraph" w:styleId="Index">
-    <w:name w:val="Index"/>
-    <w:basedOn w:val="Normal"/>
-    <w:qFormat/>
-    <w:pPr>
-      <w:suppressLineNumbers/>
-    </w:pPr>
-    <w:rPr>
-      <w:rFonts w:cs="Noto Sans Devanagari"/>
     </w:rPr>
   </w:style>
   <w:style w:type="paragraph" w:styleId="HorizontalLine">
@@ -6665,6 +6849,64 @@
     <w:qFormat/>
     <w:pPr/>
     <w:rPr/>
+  </w:style>
+  <w:style w:type="paragraph" w:styleId="Index">
+    <w:name w:val="Index"/>
+    <w:basedOn w:val="Normal"/>
+    <w:qFormat/>
+    <w:pPr>
+      <w:suppressLineNumbers/>
+    </w:pPr>
+    <w:rPr>
+      <w:rFonts w:cs="Noto Sans Devanagari"/>
+    </w:rPr>
+  </w:style>
+  <w:style w:type="paragraph" w:styleId="Caption">
+    <w:name w:val="caption"/>
+    <w:basedOn w:val="Normal"/>
+    <w:qFormat/>
+    <w:pPr>
+      <w:suppressLineNumbers/>
+      <w:spacing w:before="120" w:after="120"/>
+    </w:pPr>
+    <w:rPr>
+      <w:rFonts w:cs="Noto Sans Devanagari"/>
+      <w:i/>
+      <w:iCs/>
+      <w:sz w:val="24"/>
+      <w:szCs w:val="24"/>
+    </w:rPr>
+  </w:style>
+  <w:style w:type="paragraph" w:styleId="List">
+    <w:name w:val="List"/>
+    <w:basedOn w:val="BodyText"/>
+    <w:pPr/>
+    <w:rPr>
+      <w:rFonts w:cs="Noto Sans Devanagari"/>
+    </w:rPr>
+  </w:style>
+  <w:style w:type="paragraph" w:styleId="BodyText">
+    <w:name w:val="Body Text"/>
+    <w:basedOn w:val="Normal"/>
+    <w:pPr>
+      <w:spacing w:before="0" w:after="283"/>
+    </w:pPr>
+    <w:rPr/>
+  </w:style>
+  <w:style w:type="paragraph" w:styleId="Heading">
+    <w:name w:val="Heading"/>
+    <w:basedOn w:val="Normal"/>
+    <w:next w:val="BodyText"/>
+    <w:qFormat/>
+    <w:pPr>
+      <w:keepNext w:val="true"/>
+      <w:spacing w:before="240" w:after="283"/>
+    </w:pPr>
+    <w:rPr>
+      <w:rFonts w:ascii="Liberation Sans" w:hAnsi="Liberation Sans"/>
+      <w:sz w:val="28"/>
+      <w:szCs w:val="28"/>
+    </w:rPr>
   </w:style>
   <w:style w:type="paragraph" w:styleId="TableHeading">
     <w:name w:val="Table Heading"/>

</xml_diff>